<commit_message>
Fix: correct typos in proposal
</commit_message>
<xml_diff>
--- a/49K212.06_Proposal.docx
+++ b/49K212.06_Proposal.docx
@@ -1,6 +1,6 @@
 
 <file path=word/document.xml><?xml version="1.0" encoding="utf-8"?>
-<w:document xmlns:wpc="http://schemas.microsoft.com/office/word/2010/wordprocessingCanvas" xmlns:cx="http://schemas.microsoft.com/office/drawing/2014/chartex" xmlns:cx1="http://schemas.microsoft.com/office/drawing/2015/9/8/chartex" xmlns:cx2="http://schemas.microsoft.com/office/drawing/2015/10/21/chartex" xmlns:cx3="http://schemas.microsoft.com/office/drawing/2016/5/9/chartex" xmlns:cx4="http://schemas.microsoft.com/office/drawing/2016/5/10/chartex" xmlns:cx5="http://schemas.microsoft.com/office/drawing/2016/5/11/chartex" xmlns:cx6="http://schemas.microsoft.com/office/drawing/2016/5/12/chartex" xmlns:cx7="http://schemas.microsoft.com/office/drawing/2016/5/13/chartex" xmlns:cx8="http://schemas.microsoft.com/office/drawing/2016/5/14/chartex" xmlns:mc="http://schemas.openxmlformats.org/markup-compatibility/2006" xmlns:aink="http://schemas.microsoft.com/office/drawing/2016/ink" xmlns:am3d="http://schemas.microsoft.com/office/drawing/2017/model3d" xmlns:o="urn:schemas-microsoft-com:office:office" xmlns:r="http://schemas.openxmlformats.org/officeDocument/2006/relationships" xmlns:m="http://schemas.openxmlformats.org/officeDocument/2006/math" xmlns:v="urn:schemas-microsoft-com:vml" xmlns:wp14="http://schemas.microsoft.com/office/word/2010/wordprocessingDrawing" xmlns:wp="http://schemas.openxmlformats.org/drawingml/2006/wordprocessingDrawing" xmlns:w10="urn:schemas-microsoft-com:office:word" xmlns:w="http://schemas.openxmlformats.org/wordprocessingml/2006/main" xmlns:w14="http://schemas.microsoft.com/office/word/2010/wordml" xmlns:w15="http://schemas.microsoft.com/office/word/2012/wordml" xmlns:w16cid="http://schemas.microsoft.com/office/word/2016/wordml/cid" xmlns:w16se="http://schemas.microsoft.com/office/word/2015/wordml/symex" xmlns:wpg="http://schemas.microsoft.com/office/word/2010/wordprocessingGroup" xmlns:wpi="http://schemas.microsoft.com/office/word/2010/wordprocessingInk" xmlns:wne="http://schemas.microsoft.com/office/word/2006/wordml" xmlns:wps="http://schemas.microsoft.com/office/word/2010/wordprocessingShape" mc:Ignorable="w14 w15 w16se w16cid wp14">
+<w:document xmlns:wpc="http://schemas.microsoft.com/office/word/2010/wordprocessingCanvas" xmlns:cx="http://schemas.microsoft.com/office/drawing/2014/chartex" xmlns:cx1="http://schemas.microsoft.com/office/drawing/2015/9/8/chartex" xmlns:cx2="http://schemas.microsoft.com/office/drawing/2015/10/21/chartex" xmlns:cx3="http://schemas.microsoft.com/office/drawing/2016/5/9/chartex" xmlns:cx4="http://schemas.microsoft.com/office/drawing/2016/5/10/chartex" xmlns:cx5="http://schemas.microsoft.com/office/drawing/2016/5/11/chartex" xmlns:cx6="http://schemas.microsoft.com/office/drawing/2016/5/12/chartex" xmlns:cx7="http://schemas.microsoft.com/office/drawing/2016/5/13/chartex" xmlns:cx8="http://schemas.microsoft.com/office/drawing/2016/5/14/chartex" xmlns:mc="http://schemas.openxmlformats.org/markup-compatibility/2006" xmlns:aink="http://schemas.microsoft.com/office/drawing/2016/ink" xmlns:am3d="http://schemas.microsoft.com/office/drawing/2017/model3d" xmlns:o="urn:schemas-microsoft-com:office:office" xmlns:oel="http://schemas.microsoft.com/office/2019/extlst" xmlns:r="http://schemas.openxmlformats.org/officeDocument/2006/relationships" xmlns:m="http://schemas.openxmlformats.org/officeDocument/2006/math" xmlns:v="urn:schemas-microsoft-com:vml" xmlns:wp14="http://schemas.microsoft.com/office/word/2010/wordprocessingDrawing" xmlns:wp="http://schemas.openxmlformats.org/drawingml/2006/wordprocessingDrawing" xmlns:w10="urn:schemas-microsoft-com:office:word" xmlns:w="http://schemas.openxmlformats.org/wordprocessingml/2006/main" xmlns:w14="http://schemas.microsoft.com/office/word/2010/wordml" xmlns:w15="http://schemas.microsoft.com/office/word/2012/wordml" xmlns:w16cex="http://schemas.microsoft.com/office/word/2018/wordml/cex" xmlns:w16cid="http://schemas.microsoft.com/office/word/2016/wordml/cid" xmlns:w16="http://schemas.microsoft.com/office/word/2018/wordml" xmlns:w16du="http://schemas.microsoft.com/office/word/2023/wordml/word16du" xmlns:w16sdtdh="http://schemas.microsoft.com/office/word/2020/wordml/sdtdatahash" xmlns:w16sdtfl="http://schemas.microsoft.com/office/word/2024/wordml/sdtformatlock" xmlns:w16se="http://schemas.microsoft.com/office/word/2015/wordml/symex" xmlns:wpg="http://schemas.microsoft.com/office/word/2010/wordprocessingGroup" xmlns:wpi="http://schemas.microsoft.com/office/word/2010/wordprocessingInk" xmlns:wne="http://schemas.microsoft.com/office/word/2006/wordml" xmlns:wps="http://schemas.microsoft.com/office/word/2010/wordprocessingShape" mc:Ignorable="w14 w15 w16se w16cid w16 w16cex w16sdtdh w16sdtfl w16du wp14">
   <w:body>
     <w:p>
       <w:pPr>
@@ -285,7 +285,7 @@
           <w:sz w:val="26"/>
           <w:szCs w:val="26"/>
         </w:rPr>
-        <w:t>2</w:t>
+        <w:t>3</w:t>
       </w:r>
       <w:r>
         <w:rPr>
@@ -2261,15 +2261,18 @@
               </w:rPr>
               <w:t>Jira:</w:t>
             </w:r>
-            <w:r>
-              <w:rPr>
-                <w:rFonts w:ascii="Times New Roman" w:hAnsi="Times New Roman" w:cs="Times New Roman"/>
-                <w:sz w:val="26"/>
-                <w:szCs w:val="26"/>
-                <w:lang w:val="vi-VN"/>
-              </w:rPr>
-              <w:t>https://oanhtranngkieu05.atlassian.net/issues/?jql=assignee%20%3D%20currentUser()%20AND%20project%3D%27SG06%27%20AND%20statusCategory%20!%3D%203</w:t>
-            </w:r>
+            <w:hyperlink r:id="rId12" w:history="1">
+              <w:r>
+                <w:rPr>
+                  <w:rStyle w:val="Siuktni"/>
+                  <w:rFonts w:ascii="Times New Roman" w:hAnsi="Times New Roman" w:cs="Times New Roman"/>
+                  <w:sz w:val="26"/>
+                  <w:szCs w:val="26"/>
+                  <w:lang w:val="vi-VN"/>
+                </w:rPr>
+                <w:t>https://tranoanhqn-1772527418963.atlassian.net/jira/software/projects/SCRUM/boards/1</w:t>
+              </w:r>
+            </w:hyperlink>
           </w:p>
           <w:p>
             <w:pPr>
@@ -2360,7 +2363,7 @@
     </w:p>
     <w:p>
       <w:pPr>
-        <w:pStyle w:val="BodyText"/>
+        <w:pStyle w:val="ThnVnban"/>
         <w:spacing w:before="66"/>
         <w:ind w:right="-20"/>
         <w:jc w:val="center"/>
@@ -2896,7 +2899,7 @@
       </w:tr>
       <w:tr>
         <w:trPr>
-          <w:trHeight w:hRule="exact" w:val="802"/>
+          <w:trHeight w:hRule="exact" w:val="2260"/>
         </w:trPr>
         <w:tc>
           <w:tcPr>
@@ -2908,6 +2911,7 @@
               <w:pStyle w:val="TableParagraph"/>
               <w:ind w:left="103"/>
               <w:contextualSpacing/>
+              <w:jc w:val="center"/>
               <w:rPr>
                 <w:rFonts w:ascii="Times New Roman" w:hAnsi="Times New Roman" w:cs="Times New Roman"/>
                 <w:b/>
@@ -2915,6 +2919,16 @@
                 <w:szCs w:val="24"/>
               </w:rPr>
             </w:pPr>
+            <w:r>
+              <w:rPr>
+                <w:rFonts w:ascii="Times New Roman" w:hAnsi="Times New Roman" w:cs="Times New Roman"/>
+                <w:b/>
+                <w:sz w:val="24"/>
+                <w:szCs w:val="24"/>
+              </w:rPr>
+              <w:lastRenderedPageBreak/>
+              <w:t>2</w:t>
+            </w:r>
           </w:p>
         </w:tc>
         <w:tc>
@@ -2931,10 +2945,20 @@
               <w:contextualSpacing/>
               <w:rPr>
                 <w:rFonts w:ascii="Times New Roman" w:hAnsi="Times New Roman" w:cs="Times New Roman"/>
-                <w:sz w:val="24"/>
-                <w:szCs w:val="24"/>
-              </w:rPr>
-            </w:pPr>
+                <w:sz w:val="26"/>
+                <w:szCs w:val="26"/>
+                <w:lang w:val="vi-VN"/>
+              </w:rPr>
+            </w:pPr>
+            <w:r>
+              <w:rPr>
+                <w:rFonts w:ascii="Times New Roman" w:hAnsi="Times New Roman" w:cs="Times New Roman"/>
+                <w:sz w:val="26"/>
+                <w:szCs w:val="26"/>
+                <w:lang w:val="vi-VN"/>
+              </w:rPr>
+              <w:t>Trần Nguyễn Kiều Oanh</w:t>
+            </w:r>
           </w:p>
         </w:tc>
         <w:tc>
@@ -2946,12 +2970,39 @@
             <w:pPr>
               <w:pStyle w:val="TableParagraph"/>
               <w:contextualSpacing/>
+              <w:jc w:val="center"/>
               <w:rPr>
                 <w:rFonts w:ascii="Times New Roman" w:hAnsi="Times New Roman" w:cs="Times New Roman"/>
                 <w:sz w:val="24"/>
                 <w:szCs w:val="24"/>
               </w:rPr>
             </w:pPr>
+            <w:r>
+              <w:rPr>
+                <w:rFonts w:ascii="Times New Roman" w:hAnsi="Times New Roman" w:cs="Times New Roman"/>
+                <w:sz w:val="24"/>
+                <w:szCs w:val="24"/>
+                <w:lang w:val="vi-VN"/>
+              </w:rPr>
+              <w:t>22/0</w:t>
+            </w:r>
+            <w:r>
+              <w:rPr>
+                <w:rFonts w:ascii="Times New Roman" w:hAnsi="Times New Roman" w:cs="Times New Roman"/>
+                <w:sz w:val="24"/>
+                <w:szCs w:val="24"/>
+              </w:rPr>
+              <w:t>2</w:t>
+            </w:r>
+            <w:r>
+              <w:rPr>
+                <w:rFonts w:ascii="Times New Roman" w:hAnsi="Times New Roman" w:cs="Times New Roman"/>
+                <w:sz w:val="24"/>
+                <w:szCs w:val="24"/>
+                <w:lang w:val="vi-VN"/>
+              </w:rPr>
+              <w:t>/2026</w:t>
+            </w:r>
           </w:p>
         </w:tc>
         <w:tc>
@@ -2961,12 +3012,147 @@
           </w:tcPr>
           <w:p>
             <w:pPr>
+              <w:pStyle w:val="u1"/>
+              <w:numPr>
+                <w:ilvl w:val="0"/>
+                <w:numId w:val="1"/>
+              </w:numPr>
+              <w:rPr>
+                <w:rFonts w:cs="Times New Roman"/>
+                <w:b w:val="0"/>
+                <w:szCs w:val="26"/>
+              </w:rPr>
+            </w:pPr>
+            <w:r>
+              <w:rPr>
+                <w:rFonts w:cs="Times New Roman"/>
+                <w:b w:val="0"/>
+                <w:sz w:val="24"/>
+                <w:szCs w:val="24"/>
+                <w:lang w:val="vi-VN"/>
+              </w:rPr>
+              <w:t xml:space="preserve">Chỉnh sửa lại </w:t>
+            </w:r>
+          </w:p>
+          <w:p>
+            <w:pPr>
+              <w:pStyle w:val="u1"/>
+              <w:numPr>
+                <w:ilvl w:val="0"/>
+                <w:numId w:val="1"/>
+              </w:numPr>
+              <w:rPr>
+                <w:rFonts w:cs="Times New Roman"/>
+                <w:b w:val="0"/>
+                <w:szCs w:val="26"/>
+              </w:rPr>
+            </w:pPr>
+            <w:r>
+              <w:rPr>
+                <w:rFonts w:cs="Times New Roman"/>
+                <w:b w:val="0"/>
+                <w:szCs w:val="26"/>
+                <w:lang w:val="vi-VN"/>
+              </w:rPr>
+              <w:t xml:space="preserve">- </w:t>
+            </w:r>
+            <w:r>
+              <w:rPr>
+                <w:rFonts w:cs="Times New Roman"/>
+                <w:b w:val="0"/>
+                <w:szCs w:val="26"/>
+              </w:rPr>
+              <w:t>Master Schedule</w:t>
+            </w:r>
+          </w:p>
+          <w:p>
+            <w:pPr>
+              <w:pStyle w:val="u1"/>
+              <w:numPr>
+                <w:ilvl w:val="0"/>
+                <w:numId w:val="1"/>
+              </w:numPr>
+              <w:rPr>
+                <w:rFonts w:cs="Times New Roman"/>
+                <w:b w:val="0"/>
+                <w:szCs w:val="26"/>
+              </w:rPr>
+            </w:pPr>
+            <w:r>
+              <w:rPr>
+                <w:rFonts w:cs="Times New Roman"/>
+                <w:b w:val="0"/>
+                <w:szCs w:val="26"/>
+                <w:lang w:val="vi-VN"/>
+              </w:rPr>
+              <w:t xml:space="preserve">- </w:t>
+            </w:r>
+            <w:r>
+              <w:rPr>
+                <w:rFonts w:cs="Times New Roman"/>
+                <w:b w:val="0"/>
+                <w:szCs w:val="26"/>
+              </w:rPr>
+              <w:t>Time Estimation</w:t>
+            </w:r>
+          </w:p>
+          <w:p>
+            <w:pPr>
+              <w:pStyle w:val="u2"/>
+              <w:numPr>
+                <w:ilvl w:val="0"/>
+                <w:numId w:val="42"/>
+              </w:numPr>
+              <w:tabs>
+                <w:tab w:val="left" w:pos="65"/>
+                <w:tab w:val="left" w:pos="207"/>
+              </w:tabs>
+              <w:spacing w:before="0" w:after="0"/>
+              <w:rPr>
+                <w:rFonts w:cs="Times New Roman"/>
+                <w:b w:val="0"/>
+                <w:szCs w:val="26"/>
+              </w:rPr>
+            </w:pPr>
+            <w:r>
+              <w:rPr>
+                <w:rFonts w:cs="Times New Roman"/>
+                <w:b w:val="0"/>
+                <w:szCs w:val="26"/>
+              </w:rPr>
+              <w:t>Techniques</w:t>
+            </w:r>
+          </w:p>
+          <w:p>
+            <w:pPr>
+              <w:rPr>
+                <w:lang w:val="vi-VN"/>
+              </w:rPr>
+            </w:pPr>
+          </w:p>
+          <w:p/>
+          <w:p>
+            <w:pPr>
+              <w:pStyle w:val="oancuaDanhsach"/>
+              <w:ind w:left="720" w:firstLine="0"/>
+              <w:rPr>
+                <w:lang w:val="vi-VN"/>
+              </w:rPr>
+            </w:pPr>
+          </w:p>
+          <w:p/>
+          <w:p/>
+          <w:p/>
+          <w:p/>
+          <w:p>
+            <w:pPr>
               <w:pStyle w:val="TableParagraph"/>
               <w:contextualSpacing/>
               <w:rPr>
                 <w:rFonts w:ascii="Times New Roman" w:hAnsi="Times New Roman" w:cs="Times New Roman"/>
                 <w:sz w:val="24"/>
                 <w:szCs w:val="24"/>
+                <w:lang w:val="vi-VN"/>
               </w:rPr>
             </w:pPr>
           </w:p>
@@ -2993,6 +3179,7 @@
                 <w:b/>
                 <w:sz w:val="24"/>
                 <w:szCs w:val="24"/>
+                <w:lang w:val="vi-VN"/>
               </w:rPr>
             </w:pPr>
             <w:r>
@@ -3001,9 +3188,9 @@
                 <w:b/>
                 <w:sz w:val="24"/>
                 <w:szCs w:val="24"/>
-              </w:rPr>
-              <w:lastRenderedPageBreak/>
-              <w:t>2</w:t>
+                <w:lang w:val="vi-VN"/>
+              </w:rPr>
+              <w:t xml:space="preserve">3 </w:t>
             </w:r>
           </w:p>
         </w:tc>
@@ -3034,7 +3221,7 @@
                 <w:szCs w:val="26"/>
                 <w:lang w:val="vi-VN"/>
               </w:rPr>
-              <w:t>Trần Nguyễn Kiều Oanh</w:t>
+              <w:t>Trịnh Thảo Nguyên</w:t>
             </w:r>
           </w:p>
         </w:tc>
@@ -3053,6 +3240,7 @@
                 <w:rFonts w:ascii="Times New Roman" w:hAnsi="Times New Roman" w:cs="Times New Roman"/>
                 <w:sz w:val="24"/>
                 <w:szCs w:val="24"/>
+                <w:lang w:val="vi-VN"/>
               </w:rPr>
             </w:pPr>
             <w:r>
@@ -3062,24 +3250,7 @@
                 <w:szCs w:val="24"/>
                 <w:lang w:val="vi-VN"/>
               </w:rPr>
-              <w:t>22/0</w:t>
-            </w:r>
-            <w:r>
-              <w:rPr>
-                <w:rFonts w:ascii="Times New Roman" w:hAnsi="Times New Roman" w:cs="Times New Roman"/>
-                <w:sz w:val="24"/>
-                <w:szCs w:val="24"/>
-              </w:rPr>
-              <w:t>2</w:t>
-            </w:r>
-            <w:r>
-              <w:rPr>
-                <w:rFonts w:ascii="Times New Roman" w:hAnsi="Times New Roman" w:cs="Times New Roman"/>
-                <w:sz w:val="24"/>
-                <w:szCs w:val="24"/>
-                <w:lang w:val="vi-VN"/>
-              </w:rPr>
-              <w:t>/2026</w:t>
+              <w:t>02/04/2026</w:t>
             </w:r>
           </w:p>
         </w:tc>
@@ -3091,93 +3262,7 @@
           </w:tcPr>
           <w:p>
             <w:pPr>
-              <w:pStyle w:val="Heading1"/>
-              <w:numPr>
-                <w:ilvl w:val="0"/>
-                <w:numId w:val="1"/>
-              </w:numPr>
-              <w:rPr>
-                <w:rFonts w:cs="Times New Roman"/>
-                <w:b w:val="0"/>
-                <w:szCs w:val="26"/>
-              </w:rPr>
-            </w:pPr>
-            <w:r>
-              <w:rPr>
-                <w:rFonts w:cs="Times New Roman"/>
-                <w:b w:val="0"/>
-                <w:sz w:val="24"/>
-                <w:szCs w:val="24"/>
-                <w:lang w:val="vi-VN"/>
-              </w:rPr>
-              <w:t xml:space="preserve">Chỉnh sửa lại </w:t>
-            </w:r>
-          </w:p>
-          <w:p>
-            <w:pPr>
-              <w:pStyle w:val="Heading1"/>
-              <w:numPr>
-                <w:ilvl w:val="0"/>
-                <w:numId w:val="1"/>
-              </w:numPr>
-              <w:rPr>
-                <w:rFonts w:cs="Times New Roman"/>
-                <w:b w:val="0"/>
-                <w:szCs w:val="26"/>
-              </w:rPr>
-            </w:pPr>
-            <w:r>
-              <w:rPr>
-                <w:rFonts w:cs="Times New Roman"/>
-                <w:b w:val="0"/>
-                <w:szCs w:val="26"/>
-                <w:lang w:val="vi-VN"/>
-              </w:rPr>
-              <w:t xml:space="preserve">- </w:t>
-            </w:r>
-            <w:r>
-              <w:rPr>
-                <w:rFonts w:cs="Times New Roman"/>
-                <w:b w:val="0"/>
-                <w:szCs w:val="26"/>
-              </w:rPr>
-              <w:t>Master Schedule</w:t>
-            </w:r>
-          </w:p>
-          <w:p>
-            <w:pPr>
-              <w:pStyle w:val="Heading1"/>
-              <w:numPr>
-                <w:ilvl w:val="0"/>
-                <w:numId w:val="1"/>
-              </w:numPr>
-              <w:rPr>
-                <w:rFonts w:cs="Times New Roman"/>
-                <w:b w:val="0"/>
-                <w:szCs w:val="26"/>
-              </w:rPr>
-            </w:pPr>
-            <w:r>
-              <w:rPr>
-                <w:rFonts w:cs="Times New Roman"/>
-                <w:b w:val="0"/>
-                <w:szCs w:val="26"/>
-                <w:lang w:val="vi-VN"/>
-              </w:rPr>
-              <w:t xml:space="preserve">- </w:t>
-            </w:r>
-            <w:r>
-              <w:rPr>
-                <w:rFonts w:cs="Times New Roman"/>
-                <w:b w:val="0"/>
-                <w:szCs w:val="26"/>
-              </w:rPr>
-              <w:t>Time Estimation</w:t>
-            </w:r>
-          </w:p>
-          <w:p>
-            <w:pPr>
-              <w:pStyle w:val="Heading2"/>
+              <w:pStyle w:val="u2"/>
               <w:numPr>
                 <w:ilvl w:val="0"/>
                 <w:numId w:val="42"/>
@@ -3187,6 +3272,7 @@
                 <w:tab w:val="left" w:pos="207"/>
               </w:tabs>
               <w:spacing w:before="0" w:after="0"/>
+              <w:ind w:left="65" w:hanging="425"/>
               <w:rPr>
                 <w:rFonts w:cs="Times New Roman"/>
                 <w:b w:val="0"/>
@@ -3197,43 +3283,29 @@
               <w:rPr>
                 <w:rFonts w:cs="Times New Roman"/>
                 <w:b w:val="0"/>
-                <w:szCs w:val="26"/>
-              </w:rPr>
-              <w:t>Techniques</w:t>
-            </w:r>
-          </w:p>
-          <w:p>
-            <w:pPr>
-              <w:rPr>
-                <w:lang w:val="vi-VN"/>
-              </w:rPr>
-            </w:pPr>
-          </w:p>
-          <w:p/>
-          <w:p>
-            <w:pPr>
-              <w:pStyle w:val="ListParagraph"/>
-              <w:ind w:left="720" w:firstLine="0"/>
-              <w:rPr>
-                <w:lang w:val="vi-VN"/>
-              </w:rPr>
-            </w:pPr>
-          </w:p>
-          <w:p/>
-          <w:p/>
-          <w:p/>
-          <w:p/>
-          <w:p>
-            <w:pPr>
-              <w:pStyle w:val="TableParagraph"/>
-              <w:contextualSpacing/>
-              <w:rPr>
-                <w:rFonts w:ascii="Times New Roman" w:hAnsi="Times New Roman" w:cs="Times New Roman"/>
                 <w:sz w:val="24"/>
                 <w:szCs w:val="24"/>
                 <w:lang w:val="vi-VN"/>
               </w:rPr>
-            </w:pPr>
+              <w:t xml:space="preserve">Chỉnh sửa </w:t>
+            </w:r>
+            <w:r>
+              <w:rPr>
+                <w:rFonts w:cs="Times New Roman"/>
+                <w:b w:val="0"/>
+                <w:szCs w:val="26"/>
+              </w:rPr>
+              <w:t>Techniques</w:t>
+            </w:r>
+            <w:r>
+              <w:rPr>
+                <w:rFonts w:cs="Times New Roman"/>
+                <w:b w:val="0"/>
+                <w:szCs w:val="26"/>
+                <w:lang w:val="vi-VN"/>
+              </w:rPr>
+              <w:t xml:space="preserve"> database từ SQLite sang PostgreSQL</w:t>
+            </w:r>
           </w:p>
         </w:tc>
       </w:tr>
@@ -3265,7 +3337,7 @@
       <w:sdtContent>
         <w:p>
           <w:pPr>
-            <w:pStyle w:val="TOCHeading"/>
+            <w:pStyle w:val="uMucluc"/>
             <w:jc w:val="center"/>
             <w:rPr>
               <w:rFonts w:ascii="Times New Roman" w:hAnsi="Times New Roman" w:cs="Times New Roman"/>
@@ -3290,7 +3362,7 @@
         </w:p>
         <w:p>
           <w:pPr>
-            <w:pStyle w:val="TOC1"/>
+            <w:pStyle w:val="Mucluc1"/>
             <w:tabs>
               <w:tab w:val="left" w:pos="440"/>
               <w:tab w:val="right" w:leader="dot" w:pos="9016"/>
@@ -3330,7 +3402,7 @@
           <w:hyperlink w:anchor="_Toc219979447" w:history="1">
             <w:r>
               <w:rPr>
-                <w:rStyle w:val="Hyperlink"/>
+                <w:rStyle w:val="Siuktni"/>
                 <w:rFonts w:ascii="Times New Roman" w:hAnsi="Times New Roman" w:cs="Times New Roman"/>
                 <w:noProof/>
                 <w:sz w:val="26"/>
@@ -3350,7 +3422,7 @@
             </w:r>
             <w:r>
               <w:rPr>
-                <w:rStyle w:val="Hyperlink"/>
+                <w:rStyle w:val="Siuktni"/>
                 <w:rFonts w:ascii="Times New Roman" w:hAnsi="Times New Roman" w:cs="Times New Roman"/>
                 <w:noProof/>
                 <w:sz w:val="26"/>
@@ -3431,7 +3503,7 @@
         </w:p>
         <w:p>
           <w:pPr>
-            <w:pStyle w:val="TOC2"/>
+            <w:pStyle w:val="Mucluc2"/>
             <w:tabs>
               <w:tab w:val="left" w:pos="880"/>
               <w:tab w:val="right" w:leader="dot" w:pos="9016"/>
@@ -3447,7 +3519,7 @@
           <w:hyperlink w:anchor="_Toc219979448" w:history="1">
             <w:r>
               <w:rPr>
-                <w:rStyle w:val="Hyperlink"/>
+                <w:rStyle w:val="Siuktni"/>
                 <w:rFonts w:ascii="Times New Roman" w:hAnsi="Times New Roman" w:cs="Times New Roman"/>
                 <w:noProof/>
                 <w:sz w:val="26"/>
@@ -3467,7 +3539,7 @@
             </w:r>
             <w:r>
               <w:rPr>
-                <w:rStyle w:val="Hyperlink"/>
+                <w:rStyle w:val="Siuktni"/>
                 <w:rFonts w:ascii="Times New Roman" w:hAnsi="Times New Roman" w:cs="Times New Roman"/>
                 <w:noProof/>
                 <w:sz w:val="26"/>
@@ -3548,7 +3620,7 @@
         </w:p>
         <w:p>
           <w:pPr>
-            <w:pStyle w:val="TOC2"/>
+            <w:pStyle w:val="Mucluc2"/>
             <w:tabs>
               <w:tab w:val="left" w:pos="880"/>
               <w:tab w:val="right" w:leader="dot" w:pos="9016"/>
@@ -3564,7 +3636,7 @@
           <w:hyperlink w:anchor="_Toc219979449" w:history="1">
             <w:r>
               <w:rPr>
-                <w:rStyle w:val="Hyperlink"/>
+                <w:rStyle w:val="Siuktni"/>
                 <w:rFonts w:ascii="Times New Roman" w:hAnsi="Times New Roman" w:cs="Times New Roman"/>
                 <w:noProof/>
                 <w:sz w:val="26"/>
@@ -3584,7 +3656,7 @@
             </w:r>
             <w:r>
               <w:rPr>
-                <w:rStyle w:val="Hyperlink"/>
+                <w:rStyle w:val="Siuktni"/>
                 <w:rFonts w:ascii="Times New Roman" w:hAnsi="Times New Roman" w:cs="Times New Roman"/>
                 <w:noProof/>
                 <w:sz w:val="26"/>
@@ -3665,7 +3737,7 @@
         </w:p>
         <w:p>
           <w:pPr>
-            <w:pStyle w:val="TOC2"/>
+            <w:pStyle w:val="Mucluc2"/>
             <w:tabs>
               <w:tab w:val="left" w:pos="880"/>
               <w:tab w:val="right" w:leader="dot" w:pos="9016"/>
@@ -3681,7 +3753,7 @@
           <w:hyperlink w:anchor="_Toc219979450" w:history="1">
             <w:r>
               <w:rPr>
-                <w:rStyle w:val="Hyperlink"/>
+                <w:rStyle w:val="Siuktni"/>
                 <w:rFonts w:ascii="Times New Roman" w:hAnsi="Times New Roman" w:cs="Times New Roman"/>
                 <w:noProof/>
                 <w:sz w:val="26"/>
@@ -3701,7 +3773,7 @@
             </w:r>
             <w:r>
               <w:rPr>
-                <w:rStyle w:val="Hyperlink"/>
+                <w:rStyle w:val="Siuktni"/>
                 <w:rFonts w:ascii="Times New Roman" w:hAnsi="Times New Roman" w:cs="Times New Roman"/>
                 <w:noProof/>
                 <w:sz w:val="26"/>
@@ -3782,7 +3854,7 @@
         </w:p>
         <w:p>
           <w:pPr>
-            <w:pStyle w:val="TOC2"/>
+            <w:pStyle w:val="Mucluc2"/>
             <w:tabs>
               <w:tab w:val="left" w:pos="880"/>
               <w:tab w:val="right" w:leader="dot" w:pos="9016"/>
@@ -3798,7 +3870,7 @@
           <w:hyperlink w:anchor="_Toc219979451" w:history="1">
             <w:r>
               <w:rPr>
-                <w:rStyle w:val="Hyperlink"/>
+                <w:rStyle w:val="Siuktni"/>
                 <w:rFonts w:ascii="Times New Roman" w:hAnsi="Times New Roman" w:cs="Times New Roman"/>
                 <w:noProof/>
                 <w:sz w:val="26"/>
@@ -3818,7 +3890,7 @@
             </w:r>
             <w:r>
               <w:rPr>
-                <w:rStyle w:val="Hyperlink"/>
+                <w:rStyle w:val="Siuktni"/>
                 <w:rFonts w:ascii="Times New Roman" w:hAnsi="Times New Roman" w:cs="Times New Roman"/>
                 <w:noProof/>
                 <w:sz w:val="26"/>
@@ -3899,7 +3971,7 @@
         </w:p>
         <w:p>
           <w:pPr>
-            <w:pStyle w:val="TOC2"/>
+            <w:pStyle w:val="Mucluc2"/>
             <w:tabs>
               <w:tab w:val="left" w:pos="880"/>
               <w:tab w:val="right" w:leader="dot" w:pos="9016"/>
@@ -3915,7 +3987,7 @@
           <w:hyperlink w:anchor="_Toc219979452" w:history="1">
             <w:r>
               <w:rPr>
-                <w:rStyle w:val="Hyperlink"/>
+                <w:rStyle w:val="Siuktni"/>
                 <w:rFonts w:ascii="Times New Roman" w:hAnsi="Times New Roman" w:cs="Times New Roman"/>
                 <w:noProof/>
                 <w:sz w:val="26"/>
@@ -3935,7 +4007,7 @@
             </w:r>
             <w:r>
               <w:rPr>
-                <w:rStyle w:val="Hyperlink"/>
+                <w:rStyle w:val="Siuktni"/>
                 <w:rFonts w:ascii="Times New Roman" w:hAnsi="Times New Roman" w:cs="Times New Roman"/>
                 <w:noProof/>
                 <w:sz w:val="26"/>
@@ -4016,7 +4088,7 @@
         </w:p>
         <w:p>
           <w:pPr>
-            <w:pStyle w:val="TOC1"/>
+            <w:pStyle w:val="Mucluc1"/>
             <w:tabs>
               <w:tab w:val="left" w:pos="440"/>
               <w:tab w:val="right" w:leader="dot" w:pos="9016"/>
@@ -4032,7 +4104,7 @@
           <w:hyperlink w:anchor="_Toc219979453" w:history="1">
             <w:r>
               <w:rPr>
-                <w:rStyle w:val="Hyperlink"/>
+                <w:rStyle w:val="Siuktni"/>
                 <w:rFonts w:ascii="Times New Roman" w:hAnsi="Times New Roman" w:cs="Times New Roman"/>
                 <w:noProof/>
                 <w:sz w:val="26"/>
@@ -4052,7 +4124,7 @@
             </w:r>
             <w:r>
               <w:rPr>
-                <w:rStyle w:val="Hyperlink"/>
+                <w:rStyle w:val="Siuktni"/>
                 <w:rFonts w:ascii="Times New Roman" w:hAnsi="Times New Roman" w:cs="Times New Roman"/>
                 <w:noProof/>
                 <w:sz w:val="26"/>
@@ -4133,7 +4205,7 @@
         </w:p>
         <w:p>
           <w:pPr>
-            <w:pStyle w:val="TOC1"/>
+            <w:pStyle w:val="Mucluc1"/>
             <w:tabs>
               <w:tab w:val="left" w:pos="440"/>
               <w:tab w:val="right" w:leader="dot" w:pos="9016"/>
@@ -4149,7 +4221,7 @@
           <w:hyperlink w:anchor="_Toc219979454" w:history="1">
             <w:r>
               <w:rPr>
-                <w:rStyle w:val="Hyperlink"/>
+                <w:rStyle w:val="Siuktni"/>
                 <w:rFonts w:ascii="Times New Roman" w:hAnsi="Times New Roman" w:cs="Times New Roman"/>
                 <w:noProof/>
                 <w:sz w:val="26"/>
@@ -4169,7 +4241,7 @@
             </w:r>
             <w:r>
               <w:rPr>
-                <w:rStyle w:val="Hyperlink"/>
+                <w:rStyle w:val="Siuktni"/>
                 <w:rFonts w:ascii="Times New Roman" w:hAnsi="Times New Roman" w:cs="Times New Roman"/>
                 <w:noProof/>
                 <w:sz w:val="26"/>
@@ -4250,7 +4322,7 @@
         </w:p>
         <w:p>
           <w:pPr>
-            <w:pStyle w:val="TOC1"/>
+            <w:pStyle w:val="Mucluc1"/>
             <w:tabs>
               <w:tab w:val="left" w:pos="440"/>
               <w:tab w:val="right" w:leader="dot" w:pos="9016"/>
@@ -4266,7 +4338,7 @@
           <w:hyperlink w:anchor="_Toc219979455" w:history="1">
             <w:r>
               <w:rPr>
-                <w:rStyle w:val="Hyperlink"/>
+                <w:rStyle w:val="Siuktni"/>
                 <w:rFonts w:ascii="Times New Roman" w:hAnsi="Times New Roman" w:cs="Times New Roman"/>
                 <w:noProof/>
                 <w:sz w:val="26"/>
@@ -4286,7 +4358,7 @@
             </w:r>
             <w:r>
               <w:rPr>
-                <w:rStyle w:val="Hyperlink"/>
+                <w:rStyle w:val="Siuktni"/>
                 <w:rFonts w:ascii="Times New Roman" w:hAnsi="Times New Roman" w:cs="Times New Roman"/>
                 <w:noProof/>
                 <w:sz w:val="26"/>
@@ -4410,7 +4482,7 @@
     </w:p>
     <w:p>
       <w:pPr>
-        <w:pStyle w:val="Heading1"/>
+        <w:pStyle w:val="u1"/>
         <w:numPr>
           <w:ilvl w:val="0"/>
           <w:numId w:val="1"/>
@@ -4434,7 +4506,7 @@
     </w:p>
     <w:p>
       <w:pPr>
-        <w:pStyle w:val="Heading2"/>
+        <w:pStyle w:val="u2"/>
         <w:numPr>
           <w:ilvl w:val="1"/>
           <w:numId w:val="1"/>
@@ -4457,7 +4529,7 @@
     </w:p>
     <w:p>
       <w:pPr>
-        <w:pStyle w:val="NormalWeb"/>
+        <w:pStyle w:val="ThngthngWeb"/>
         <w:spacing w:before="120" w:beforeAutospacing="0" w:after="120" w:afterAutospacing="0" w:line="360" w:lineRule="auto"/>
         <w:ind w:left="420" w:firstLine="360"/>
         <w:jc w:val="both"/>
@@ -4503,7 +4575,7 @@
     </w:p>
     <w:p>
       <w:pPr>
-        <w:pStyle w:val="NormalWeb"/>
+        <w:pStyle w:val="ThngthngWeb"/>
         <w:numPr>
           <w:ilvl w:val="0"/>
           <w:numId w:val="24"/>
@@ -4532,7 +4604,7 @@
     </w:p>
     <w:p>
       <w:pPr>
-        <w:pStyle w:val="NormalWeb"/>
+        <w:pStyle w:val="ThngthngWeb"/>
         <w:numPr>
           <w:ilvl w:val="0"/>
           <w:numId w:val="24"/>
@@ -4561,7 +4633,7 @@
     </w:p>
     <w:p>
       <w:pPr>
-        <w:pStyle w:val="NormalWeb"/>
+        <w:pStyle w:val="ThngthngWeb"/>
         <w:numPr>
           <w:ilvl w:val="0"/>
           <w:numId w:val="24"/>
@@ -4590,7 +4662,7 @@
     </w:p>
     <w:p>
       <w:pPr>
-        <w:pStyle w:val="NormalWeb"/>
+        <w:pStyle w:val="ThngthngWeb"/>
         <w:numPr>
           <w:ilvl w:val="0"/>
           <w:numId w:val="24"/>
@@ -4619,7 +4691,7 @@
     </w:p>
     <w:p>
       <w:pPr>
-        <w:pStyle w:val="Heading2"/>
+        <w:pStyle w:val="u2"/>
         <w:numPr>
           <w:ilvl w:val="1"/>
           <w:numId w:val="1"/>
@@ -4642,7 +4714,7 @@
     </w:p>
     <w:p>
       <w:pPr>
-        <w:pStyle w:val="NormalWeb"/>
+        <w:pStyle w:val="ThngthngWeb"/>
         <w:numPr>
           <w:ilvl w:val="0"/>
           <w:numId w:val="25"/>
@@ -4669,7 +4741,7 @@
     </w:p>
     <w:p>
       <w:pPr>
-        <w:pStyle w:val="NormalWeb"/>
+        <w:pStyle w:val="ThngthngWeb"/>
         <w:spacing w:before="0" w:beforeAutospacing="0" w:after="0" w:afterAutospacing="0" w:line="360" w:lineRule="auto"/>
         <w:ind w:left="507" w:firstLine="420"/>
         <w:jc w:val="both"/>
@@ -4690,7 +4762,7 @@
     </w:p>
     <w:p>
       <w:pPr>
-        <w:pStyle w:val="NormalWeb"/>
+        <w:pStyle w:val="ThngthngWeb"/>
         <w:numPr>
           <w:ilvl w:val="0"/>
           <w:numId w:val="26"/>
@@ -4722,7 +4794,7 @@
     </w:p>
     <w:p>
       <w:pPr>
-        <w:pStyle w:val="NormalWeb"/>
+        <w:pStyle w:val="ThngthngWeb"/>
         <w:numPr>
           <w:ilvl w:val="0"/>
           <w:numId w:val="26"/>
@@ -4755,7 +4827,7 @@
     </w:p>
     <w:p>
       <w:pPr>
-        <w:pStyle w:val="NormalWeb"/>
+        <w:pStyle w:val="ThngthngWeb"/>
         <w:numPr>
           <w:ilvl w:val="0"/>
           <w:numId w:val="26"/>
@@ -4787,7 +4859,7 @@
     </w:p>
     <w:p>
       <w:pPr>
-        <w:pStyle w:val="NormalWeb"/>
+        <w:pStyle w:val="ThngthngWeb"/>
         <w:numPr>
           <w:ilvl w:val="0"/>
           <w:numId w:val="18"/>
@@ -4820,7 +4892,7 @@
     </w:p>
     <w:p>
       <w:pPr>
-        <w:pStyle w:val="NormalWeb"/>
+        <w:pStyle w:val="ThngthngWeb"/>
         <w:spacing w:before="0" w:beforeAutospacing="0" w:after="0" w:afterAutospacing="0" w:line="360" w:lineRule="auto"/>
         <w:ind w:left="360" w:firstLine="360"/>
         <w:jc w:val="both"/>
@@ -4841,7 +4913,7 @@
     </w:p>
     <w:p>
       <w:pPr>
-        <w:pStyle w:val="NormalWeb"/>
+        <w:pStyle w:val="ThngthngWeb"/>
         <w:numPr>
           <w:ilvl w:val="0"/>
           <w:numId w:val="27"/>
@@ -4873,7 +4945,7 @@
     </w:p>
     <w:p>
       <w:pPr>
-        <w:pStyle w:val="NormalWeb"/>
+        <w:pStyle w:val="ThngthngWeb"/>
         <w:numPr>
           <w:ilvl w:val="0"/>
           <w:numId w:val="27"/>
@@ -4905,7 +4977,7 @@
     </w:p>
     <w:p>
       <w:pPr>
-        <w:pStyle w:val="Heading2"/>
+        <w:pStyle w:val="u2"/>
         <w:numPr>
           <w:ilvl w:val="1"/>
           <w:numId w:val="1"/>
@@ -4928,7 +5000,7 @@
     </w:p>
     <w:p>
       <w:pPr>
-        <w:pStyle w:val="NormalWeb"/>
+        <w:pStyle w:val="ThngthngWeb"/>
         <w:spacing w:before="0" w:beforeAutospacing="0" w:after="0" w:afterAutospacing="0" w:line="360" w:lineRule="auto"/>
         <w:ind w:left="300" w:firstLine="420"/>
         <w:jc w:val="both"/>
@@ -4957,7 +5029,7 @@
     </w:p>
     <w:p>
       <w:pPr>
-        <w:pStyle w:val="NormalWeb"/>
+        <w:pStyle w:val="ThngthngWeb"/>
         <w:numPr>
           <w:ilvl w:val="0"/>
           <w:numId w:val="28"/>
@@ -4989,7 +5061,7 @@
     </w:p>
     <w:p>
       <w:pPr>
-        <w:pStyle w:val="NormalWeb"/>
+        <w:pStyle w:val="ThngthngWeb"/>
         <w:numPr>
           <w:ilvl w:val="0"/>
           <w:numId w:val="28"/>
@@ -5021,7 +5093,7 @@
     </w:p>
     <w:p>
       <w:pPr>
-        <w:pStyle w:val="NormalWeb"/>
+        <w:pStyle w:val="ThngthngWeb"/>
         <w:numPr>
           <w:ilvl w:val="0"/>
           <w:numId w:val="28"/>
@@ -5045,7 +5117,7 @@
     </w:p>
     <w:p>
       <w:pPr>
-        <w:pStyle w:val="NormalWeb"/>
+        <w:pStyle w:val="ThngthngWeb"/>
         <w:numPr>
           <w:ilvl w:val="0"/>
           <w:numId w:val="29"/>
@@ -5078,7 +5150,7 @@
     </w:p>
     <w:p>
       <w:pPr>
-        <w:pStyle w:val="NormalWeb"/>
+        <w:pStyle w:val="ThngthngWeb"/>
         <w:numPr>
           <w:ilvl w:val="0"/>
           <w:numId w:val="29"/>
@@ -5111,7 +5183,7 @@
     </w:p>
     <w:p>
       <w:pPr>
-        <w:pStyle w:val="NormalWeb"/>
+        <w:pStyle w:val="ThngthngWeb"/>
         <w:numPr>
           <w:ilvl w:val="0"/>
           <w:numId w:val="30"/>
@@ -5144,7 +5216,7 @@
     </w:p>
     <w:p>
       <w:pPr>
-        <w:pStyle w:val="Heading2"/>
+        <w:pStyle w:val="u2"/>
         <w:numPr>
           <w:ilvl w:val="1"/>
           <w:numId w:val="1"/>
@@ -5372,7 +5444,7 @@
     </w:p>
     <w:p>
       <w:pPr>
-        <w:pStyle w:val="Heading2"/>
+        <w:pStyle w:val="u2"/>
         <w:numPr>
           <w:ilvl w:val="1"/>
           <w:numId w:val="1"/>
@@ -5395,7 +5467,7 @@
     </w:p>
     <w:p>
       <w:pPr>
-        <w:pStyle w:val="NormalWeb"/>
+        <w:pStyle w:val="ThngthngWeb"/>
         <w:numPr>
           <w:ilvl w:val="0"/>
           <w:numId w:val="21"/>
@@ -5426,7 +5498,7 @@
     </w:p>
     <w:p>
       <w:pPr>
-        <w:pStyle w:val="NormalWeb"/>
+        <w:pStyle w:val="ThngthngWeb"/>
         <w:numPr>
           <w:ilvl w:val="0"/>
           <w:numId w:val="21"/>
@@ -5465,7 +5537,7 @@
     </w:p>
     <w:p>
       <w:pPr>
-        <w:pStyle w:val="NormalWeb"/>
+        <w:pStyle w:val="ThngthngWeb"/>
         <w:numPr>
           <w:ilvl w:val="0"/>
           <w:numId w:val="21"/>
@@ -5503,7 +5575,7 @@
     </w:p>
     <w:p>
       <w:pPr>
-        <w:pStyle w:val="NormalWeb"/>
+        <w:pStyle w:val="ThngthngWeb"/>
         <w:numPr>
           <w:ilvl w:val="0"/>
           <w:numId w:val="21"/>
@@ -5521,7 +5593,7 @@
           <w:sz w:val="26"/>
           <w:szCs w:val="26"/>
         </w:rPr>
-        <w:t>Database: SQLite3</w:t>
+        <w:t xml:space="preserve">Database: </w:t>
       </w:r>
       <w:r>
         <w:rPr>
@@ -5529,12 +5601,12 @@
           <w:sz w:val="26"/>
           <w:szCs w:val="26"/>
         </w:rPr>
-        <w:t>.</w:t>
+        <w:t>PostgreSQL</w:t>
       </w:r>
     </w:p>
     <w:p>
       <w:pPr>
-        <w:pStyle w:val="NormalWeb"/>
+        <w:pStyle w:val="ThngthngWeb"/>
         <w:numPr>
           <w:ilvl w:val="0"/>
           <w:numId w:val="21"/>
@@ -5581,7 +5653,7 @@
     </w:p>
     <w:p>
       <w:pPr>
-        <w:pStyle w:val="Heading1"/>
+        <w:pStyle w:val="u1"/>
         <w:numPr>
           <w:ilvl w:val="0"/>
           <w:numId w:val="1"/>
@@ -5875,13 +5947,15 @@
                 <w:rFonts w:ascii="Times New Roman" w:hAnsi="Times New Roman" w:cs="Times New Roman"/>
                 <w:sz w:val="26"/>
                 <w:szCs w:val="26"/>
-              </w:rPr>
-            </w:pPr>
-            <w:r>
-              <w:rPr>
-                <w:rFonts w:ascii="Times New Roman" w:hAnsi="Times New Roman" w:cs="Times New Roman"/>
-                <w:sz w:val="26"/>
-                <w:szCs w:val="26"/>
+                <w:lang w:val="vi-VN"/>
+              </w:rPr>
+            </w:pPr>
+            <w:r>
+              <w:rPr>
+                <w:rFonts w:ascii="Times New Roman" w:hAnsi="Times New Roman" w:cs="Times New Roman"/>
+                <w:sz w:val="26"/>
+                <w:szCs w:val="26"/>
+                <w:lang w:val="vi-VN"/>
               </w:rPr>
               <w:t>5</w:t>
             </w:r>
@@ -5963,8 +6037,6 @@
             </w:r>
           </w:p>
         </w:tc>
-        <w:bookmarkStart w:id="7" w:name="_GoBack"/>
-        <w:bookmarkEnd w:id="7"/>
       </w:tr>
       <w:tr>
         <w:tc>
@@ -6041,7 +6113,7 @@
     </w:tbl>
     <w:p>
       <w:pPr>
-        <w:pStyle w:val="Heading1"/>
+        <w:pStyle w:val="u1"/>
         <w:numPr>
           <w:ilvl w:val="0"/>
           <w:numId w:val="1"/>
@@ -6051,7 +6123,7 @@
           <w:szCs w:val="26"/>
         </w:rPr>
       </w:pPr>
-      <w:bookmarkStart w:id="8" w:name="_Toc219979454"/>
+      <w:bookmarkStart w:id="7" w:name="_Toc219979454"/>
       <w:r>
         <w:rPr>
           <w:rFonts w:cs="Times New Roman"/>
@@ -6059,7 +6131,7 @@
         </w:rPr>
         <w:t>MASTER SCHEDULE</w:t>
       </w:r>
-      <w:bookmarkEnd w:id="8"/>
+      <w:bookmarkEnd w:id="7"/>
     </w:p>
     <w:tbl>
       <w:tblPr>
@@ -6645,7 +6717,7 @@
           </w:p>
           <w:p>
             <w:pPr>
-              <w:pStyle w:val="ListParagraph"/>
+              <w:pStyle w:val="oancuaDanhsach"/>
               <w:numPr>
                 <w:ilvl w:val="0"/>
                 <w:numId w:val="21"/>
@@ -6671,7 +6743,7 @@
           </w:p>
           <w:p>
             <w:pPr>
-              <w:pStyle w:val="ListParagraph"/>
+              <w:pStyle w:val="oancuaDanhsach"/>
               <w:numPr>
                 <w:ilvl w:val="0"/>
                 <w:numId w:val="32"/>
@@ -6698,7 +6770,7 @@
           </w:p>
           <w:p>
             <w:pPr>
-              <w:pStyle w:val="ListParagraph"/>
+              <w:pStyle w:val="oancuaDanhsach"/>
               <w:numPr>
                 <w:ilvl w:val="0"/>
                 <w:numId w:val="32"/>
@@ -6752,7 +6824,7 @@
           </w:p>
           <w:p>
             <w:pPr>
-              <w:pStyle w:val="ListParagraph"/>
+              <w:pStyle w:val="oancuaDanhsach"/>
               <w:numPr>
                 <w:ilvl w:val="0"/>
                 <w:numId w:val="31"/>
@@ -6777,7 +6849,7 @@
           </w:p>
           <w:p>
             <w:pPr>
-              <w:pStyle w:val="ListParagraph"/>
+              <w:pStyle w:val="oancuaDanhsach"/>
               <w:numPr>
                 <w:ilvl w:val="0"/>
                 <w:numId w:val="31"/>
@@ -6802,7 +6874,7 @@
           </w:p>
           <w:p>
             <w:pPr>
-              <w:pStyle w:val="ListParagraph"/>
+              <w:pStyle w:val="oancuaDanhsach"/>
               <w:numPr>
                 <w:ilvl w:val="0"/>
                 <w:numId w:val="31"/>
@@ -7120,7 +7192,7 @@
           </w:p>
           <w:p>
             <w:pPr>
-              <w:pStyle w:val="ListParagraph"/>
+              <w:pStyle w:val="oancuaDanhsach"/>
               <w:numPr>
                 <w:ilvl w:val="0"/>
                 <w:numId w:val="33"/>
@@ -7145,7 +7217,7 @@
           </w:p>
           <w:p>
             <w:pPr>
-              <w:pStyle w:val="ListParagraph"/>
+              <w:pStyle w:val="oancuaDanhsach"/>
               <w:numPr>
                 <w:ilvl w:val="0"/>
                 <w:numId w:val="33"/>
@@ -7170,7 +7242,7 @@
           </w:p>
           <w:p>
             <w:pPr>
-              <w:pStyle w:val="ListParagraph"/>
+              <w:pStyle w:val="oancuaDanhsach"/>
               <w:numPr>
                 <w:ilvl w:val="0"/>
                 <w:numId w:val="33"/>
@@ -7227,7 +7299,7 @@
           </w:p>
           <w:p>
             <w:pPr>
-              <w:pStyle w:val="ListParagraph"/>
+              <w:pStyle w:val="oancuaDanhsach"/>
               <w:numPr>
                 <w:ilvl w:val="0"/>
                 <w:numId w:val="34"/>
@@ -7252,7 +7324,7 @@
           </w:p>
           <w:p>
             <w:pPr>
-              <w:pStyle w:val="ListParagraph"/>
+              <w:pStyle w:val="oancuaDanhsach"/>
               <w:numPr>
                 <w:ilvl w:val="0"/>
                 <w:numId w:val="34"/>
@@ -7277,7 +7349,7 @@
           </w:p>
           <w:p>
             <w:pPr>
-              <w:pStyle w:val="ListParagraph"/>
+              <w:pStyle w:val="oancuaDanhsach"/>
               <w:numPr>
                 <w:ilvl w:val="0"/>
                 <w:numId w:val="34"/>
@@ -7302,7 +7374,7 @@
           </w:p>
           <w:p>
             <w:pPr>
-              <w:pStyle w:val="ListParagraph"/>
+              <w:pStyle w:val="oancuaDanhsach"/>
               <w:numPr>
                 <w:ilvl w:val="0"/>
                 <w:numId w:val="34"/>
@@ -7588,7 +7660,7 @@
           </w:p>
           <w:p>
             <w:pPr>
-              <w:pStyle w:val="ListParagraph"/>
+              <w:pStyle w:val="oancuaDanhsach"/>
               <w:numPr>
                 <w:ilvl w:val="0"/>
                 <w:numId w:val="36"/>
@@ -7613,7 +7685,7 @@
           </w:p>
           <w:p>
             <w:pPr>
-              <w:pStyle w:val="ListParagraph"/>
+              <w:pStyle w:val="oancuaDanhsach"/>
               <w:numPr>
                 <w:ilvl w:val="0"/>
                 <w:numId w:val="36"/>
@@ -7638,7 +7710,7 @@
           </w:p>
           <w:p>
             <w:pPr>
-              <w:pStyle w:val="ListParagraph"/>
+              <w:pStyle w:val="oancuaDanhsach"/>
               <w:numPr>
                 <w:ilvl w:val="0"/>
                 <w:numId w:val="36"/>
@@ -7686,7 +7758,7 @@
           </w:p>
           <w:p>
             <w:pPr>
-              <w:pStyle w:val="ListParagraph"/>
+              <w:pStyle w:val="oancuaDanhsach"/>
               <w:numPr>
                 <w:ilvl w:val="0"/>
                 <w:numId w:val="36"/>
@@ -7713,7 +7785,7 @@
           </w:p>
           <w:p>
             <w:pPr>
-              <w:pStyle w:val="ListParagraph"/>
+              <w:pStyle w:val="oancuaDanhsach"/>
               <w:numPr>
                 <w:ilvl w:val="0"/>
                 <w:numId w:val="36"/>
@@ -7740,7 +7812,7 @@
           </w:p>
           <w:p>
             <w:pPr>
-              <w:pStyle w:val="ListParagraph"/>
+              <w:pStyle w:val="oancuaDanhsach"/>
               <w:numPr>
                 <w:ilvl w:val="0"/>
                 <w:numId w:val="36"/>
@@ -8004,7 +8076,7 @@
           </w:p>
           <w:p>
             <w:pPr>
-              <w:pStyle w:val="ListParagraph"/>
+              <w:pStyle w:val="oancuaDanhsach"/>
               <w:numPr>
                 <w:ilvl w:val="0"/>
                 <w:numId w:val="35"/>
@@ -8029,7 +8101,7 @@
           </w:p>
           <w:p>
             <w:pPr>
-              <w:pStyle w:val="ListParagraph"/>
+              <w:pStyle w:val="oancuaDanhsach"/>
               <w:numPr>
                 <w:ilvl w:val="0"/>
                 <w:numId w:val="35"/>
@@ -8054,7 +8126,7 @@
           </w:p>
           <w:p>
             <w:pPr>
-              <w:pStyle w:val="ListParagraph"/>
+              <w:pStyle w:val="oancuaDanhsach"/>
               <w:numPr>
                 <w:ilvl w:val="0"/>
                 <w:numId w:val="35"/>
@@ -8101,7 +8173,7 @@
           </w:p>
           <w:p>
             <w:pPr>
-              <w:pStyle w:val="ListParagraph"/>
+              <w:pStyle w:val="oancuaDanhsach"/>
               <w:numPr>
                 <w:ilvl w:val="0"/>
                 <w:numId w:val="35"/>
@@ -8128,7 +8200,7 @@
           </w:p>
           <w:p>
             <w:pPr>
-              <w:pStyle w:val="ListParagraph"/>
+              <w:pStyle w:val="oancuaDanhsach"/>
               <w:numPr>
                 <w:ilvl w:val="0"/>
                 <w:numId w:val="35"/>
@@ -8155,7 +8227,7 @@
           </w:p>
           <w:p>
             <w:pPr>
-              <w:pStyle w:val="ListParagraph"/>
+              <w:pStyle w:val="oancuaDanhsach"/>
               <w:numPr>
                 <w:ilvl w:val="0"/>
                 <w:numId w:val="35"/>
@@ -8183,7 +8255,7 @@
           </w:p>
           <w:p>
             <w:pPr>
-              <w:pStyle w:val="ListParagraph"/>
+              <w:pStyle w:val="oancuaDanhsach"/>
               <w:numPr>
                 <w:ilvl w:val="0"/>
                 <w:numId w:val="35"/>
@@ -8448,7 +8520,7 @@
           </w:p>
           <w:p>
             <w:pPr>
-              <w:pStyle w:val="ListParagraph"/>
+              <w:pStyle w:val="oancuaDanhsach"/>
               <w:numPr>
                 <w:ilvl w:val="0"/>
                 <w:numId w:val="37"/>
@@ -8473,7 +8545,7 @@
           </w:p>
           <w:p>
             <w:pPr>
-              <w:pStyle w:val="ListParagraph"/>
+              <w:pStyle w:val="oancuaDanhsach"/>
               <w:numPr>
                 <w:ilvl w:val="0"/>
                 <w:numId w:val="37"/>
@@ -8520,7 +8592,7 @@
           </w:p>
           <w:p>
             <w:pPr>
-              <w:pStyle w:val="ListParagraph"/>
+              <w:pStyle w:val="oancuaDanhsach"/>
               <w:numPr>
                 <w:ilvl w:val="0"/>
                 <w:numId w:val="38"/>
@@ -8547,7 +8619,7 @@
           </w:p>
           <w:p>
             <w:pPr>
-              <w:pStyle w:val="ListParagraph"/>
+              <w:pStyle w:val="oancuaDanhsach"/>
               <w:numPr>
                 <w:ilvl w:val="0"/>
                 <w:numId w:val="38"/>
@@ -8772,7 +8844,7 @@
           </w:p>
           <w:p>
             <w:pPr>
-              <w:pStyle w:val="ListParagraph"/>
+              <w:pStyle w:val="oancuaDanhsach"/>
               <w:numPr>
                 <w:ilvl w:val="0"/>
                 <w:numId w:val="38"/>
@@ -8819,7 +8891,7 @@
           </w:p>
           <w:p>
             <w:pPr>
-              <w:pStyle w:val="ListParagraph"/>
+              <w:pStyle w:val="oancuaDanhsach"/>
               <w:numPr>
                 <w:ilvl w:val="0"/>
                 <w:numId w:val="38"/>
@@ -8844,7 +8916,7 @@
           </w:p>
           <w:p>
             <w:pPr>
-              <w:pStyle w:val="ListParagraph"/>
+              <w:pStyle w:val="oancuaDanhsach"/>
               <w:numPr>
                 <w:ilvl w:val="0"/>
                 <w:numId w:val="38"/>
@@ -8869,7 +8941,7 @@
           </w:p>
           <w:p>
             <w:pPr>
-              <w:pStyle w:val="ListParagraph"/>
+              <w:pStyle w:val="oancuaDanhsach"/>
               <w:numPr>
                 <w:ilvl w:val="0"/>
                 <w:numId w:val="38"/>
@@ -8894,7 +8966,7 @@
           </w:p>
           <w:p>
             <w:pPr>
-              <w:pStyle w:val="ListParagraph"/>
+              <w:pStyle w:val="oancuaDanhsach"/>
               <w:numPr>
                 <w:ilvl w:val="0"/>
                 <w:numId w:val="38"/>
@@ -8922,7 +8994,7 @@
     </w:tbl>
     <w:p>
       <w:pPr>
-        <w:pStyle w:val="Heading1"/>
+        <w:pStyle w:val="u1"/>
         <w:numPr>
           <w:ilvl w:val="0"/>
           <w:numId w:val="1"/>
@@ -8932,8 +9004,8 @@
           <w:szCs w:val="26"/>
         </w:rPr>
       </w:pPr>
-      <w:bookmarkStart w:id="9" w:name="_Toc492589332"/>
-      <w:bookmarkStart w:id="10" w:name="_Toc219979455"/>
+      <w:bookmarkStart w:id="8" w:name="_Toc492589332"/>
+      <w:bookmarkStart w:id="9" w:name="_Toc219979455"/>
       <w:r>
         <w:rPr>
           <w:rFonts w:cs="Times New Roman"/>
@@ -8942,8 +9014,8 @@
         <w:lastRenderedPageBreak/>
         <w:t>ROLES AND RESPONSIBILITIES</w:t>
       </w:r>
+      <w:bookmarkEnd w:id="8"/>
       <w:bookmarkEnd w:id="9"/>
-      <w:bookmarkEnd w:id="10"/>
     </w:p>
     <w:tbl>
       <w:tblPr>
@@ -8957,9 +9029,9 @@
         <w:tblLook w:val="04A0" w:firstRow="1" w:lastRow="0" w:firstColumn="1" w:lastColumn="0" w:noHBand="0" w:noVBand="1"/>
       </w:tblPr>
       <w:tblGrid>
-        <w:gridCol w:w="1581"/>
-        <w:gridCol w:w="5489"/>
-        <w:gridCol w:w="1940"/>
+        <w:gridCol w:w="1471"/>
+        <w:gridCol w:w="5589"/>
+        <w:gridCol w:w="1950"/>
       </w:tblGrid>
       <w:tr>
         <w:trPr>
@@ -9113,6 +9185,7 @@
                 <w:rFonts w:ascii="Times New Roman" w:hAnsi="Times New Roman" w:cs="Times New Roman"/>
                 <w:sz w:val="26"/>
                 <w:szCs w:val="26"/>
+                <w:lang w:val="vi-VN"/>
               </w:rPr>
             </w:pPr>
             <w:r>
@@ -9123,7 +9196,18 @@
                 <w:sz w:val="26"/>
                 <w:szCs w:val="26"/>
               </w:rPr>
-              <w:t>Product owner</w:t>
+              <w:t>Scrum</w:t>
+            </w:r>
+            <w:r>
+              <w:rPr>
+                <w:rFonts w:ascii="Times New Roman" w:hAnsi="Times New Roman" w:cs="Times New Roman"/>
+                <w:b/>
+                <w:bCs/>
+                <w:sz w:val="26"/>
+                <w:szCs w:val="26"/>
+                <w:lang w:val="vi-VN"/>
+              </w:rPr>
+              <w:t xml:space="preserve"> Master</w:t>
             </w:r>
           </w:p>
           <w:p>
@@ -9141,7 +9225,32 @@
                 <w:sz w:val="26"/>
                 <w:szCs w:val="26"/>
               </w:rPr>
-              <w:t>(Kiêm Backend Dev)</w:t>
+              <w:t xml:space="preserve">(Kiêm </w:t>
+            </w:r>
+            <w:r>
+              <w:rPr>
+                <w:rFonts w:ascii="Times New Roman" w:hAnsi="Times New Roman" w:cs="Times New Roman"/>
+                <w:sz w:val="26"/>
+                <w:szCs w:val="26"/>
+              </w:rPr>
+              <w:t>Full</w:t>
+            </w:r>
+            <w:r>
+              <w:rPr>
+                <w:rFonts w:ascii="Times New Roman" w:hAnsi="Times New Roman" w:cs="Times New Roman"/>
+                <w:sz w:val="26"/>
+                <w:szCs w:val="26"/>
+                <w:lang w:val="vi-VN"/>
+              </w:rPr>
+              <w:t xml:space="preserve"> Stack</w:t>
+            </w:r>
+            <w:r>
+              <w:rPr>
+                <w:rFonts w:ascii="Times New Roman" w:hAnsi="Times New Roman" w:cs="Times New Roman"/>
+                <w:sz w:val="26"/>
+                <w:szCs w:val="26"/>
+              </w:rPr>
+              <w:t>)</w:t>
             </w:r>
           </w:p>
         </w:tc>
@@ -9873,7 +9982,7 @@
       </w:pPr>
     </w:p>
     <w:sectPr>
-      <w:footerReference w:type="default" r:id="rId12"/>
+      <w:footerReference w:type="default" r:id="rId13"/>
       <w:pgSz w:w="11906" w:h="16838"/>
       <w:pgMar w:top="1440" w:right="1440" w:bottom="1440" w:left="1440" w:header="720" w:footer="720" w:gutter="0"/>
       <w:pgNumType w:start="1"/>
@@ -9885,7 +9994,7 @@
 </file>
 
 <file path=word/endnotes.xml><?xml version="1.0" encoding="utf-8"?>
-<w:endnotes xmlns:wpc="http://schemas.microsoft.com/office/word/2010/wordprocessingCanvas" xmlns:cx="http://schemas.microsoft.com/office/drawing/2014/chartex" xmlns:cx1="http://schemas.microsoft.com/office/drawing/2015/9/8/chartex" xmlns:cx2="http://schemas.microsoft.com/office/drawing/2015/10/21/chartex" xmlns:cx3="http://schemas.microsoft.com/office/drawing/2016/5/9/chartex" xmlns:cx4="http://schemas.microsoft.com/office/drawing/2016/5/10/chartex" xmlns:cx5="http://schemas.microsoft.com/office/drawing/2016/5/11/chartex" xmlns:cx6="http://schemas.microsoft.com/office/drawing/2016/5/12/chartex" xmlns:cx7="http://schemas.microsoft.com/office/drawing/2016/5/13/chartex" xmlns:cx8="http://schemas.microsoft.com/office/drawing/2016/5/14/chartex" xmlns:mc="http://schemas.openxmlformats.org/markup-compatibility/2006" xmlns:aink="http://schemas.microsoft.com/office/drawing/2016/ink" xmlns:am3d="http://schemas.microsoft.com/office/drawing/2017/model3d" xmlns:o="urn:schemas-microsoft-com:office:office" xmlns:r="http://schemas.openxmlformats.org/officeDocument/2006/relationships" xmlns:m="http://schemas.openxmlformats.org/officeDocument/2006/math" xmlns:v="urn:schemas-microsoft-com:vml" xmlns:wp14="http://schemas.microsoft.com/office/word/2010/wordprocessingDrawing" xmlns:wp="http://schemas.openxmlformats.org/drawingml/2006/wordprocessingDrawing" xmlns:w10="urn:schemas-microsoft-com:office:word" xmlns:w="http://schemas.openxmlformats.org/wordprocessingml/2006/main" xmlns:w14="http://schemas.microsoft.com/office/word/2010/wordml" xmlns:w15="http://schemas.microsoft.com/office/word/2012/wordml" xmlns:w16cid="http://schemas.microsoft.com/office/word/2016/wordml/cid" xmlns:w16se="http://schemas.microsoft.com/office/word/2015/wordml/symex" xmlns:wpg="http://schemas.microsoft.com/office/word/2010/wordprocessingGroup" xmlns:wpi="http://schemas.microsoft.com/office/word/2010/wordprocessingInk" xmlns:wne="http://schemas.microsoft.com/office/word/2006/wordml" xmlns:wps="http://schemas.microsoft.com/office/word/2010/wordprocessingShape" mc:Ignorable="w14 w15 w16se w16cid wp14">
+<w:endnotes xmlns:wpc="http://schemas.microsoft.com/office/word/2010/wordprocessingCanvas" xmlns:cx="http://schemas.microsoft.com/office/drawing/2014/chartex" xmlns:cx1="http://schemas.microsoft.com/office/drawing/2015/9/8/chartex" xmlns:cx2="http://schemas.microsoft.com/office/drawing/2015/10/21/chartex" xmlns:cx3="http://schemas.microsoft.com/office/drawing/2016/5/9/chartex" xmlns:cx4="http://schemas.microsoft.com/office/drawing/2016/5/10/chartex" xmlns:cx5="http://schemas.microsoft.com/office/drawing/2016/5/11/chartex" xmlns:cx6="http://schemas.microsoft.com/office/drawing/2016/5/12/chartex" xmlns:cx7="http://schemas.microsoft.com/office/drawing/2016/5/13/chartex" xmlns:cx8="http://schemas.microsoft.com/office/drawing/2016/5/14/chartex" xmlns:mc="http://schemas.openxmlformats.org/markup-compatibility/2006" xmlns:aink="http://schemas.microsoft.com/office/drawing/2016/ink" xmlns:am3d="http://schemas.microsoft.com/office/drawing/2017/model3d" xmlns:o="urn:schemas-microsoft-com:office:office" xmlns:oel="http://schemas.microsoft.com/office/2019/extlst" xmlns:r="http://schemas.openxmlformats.org/officeDocument/2006/relationships" xmlns:m="http://schemas.openxmlformats.org/officeDocument/2006/math" xmlns:v="urn:schemas-microsoft-com:vml" xmlns:wp14="http://schemas.microsoft.com/office/word/2010/wordprocessingDrawing" xmlns:wp="http://schemas.openxmlformats.org/drawingml/2006/wordprocessingDrawing" xmlns:w10="urn:schemas-microsoft-com:office:word" xmlns:w="http://schemas.openxmlformats.org/wordprocessingml/2006/main" xmlns:w14="http://schemas.microsoft.com/office/word/2010/wordml" xmlns:w15="http://schemas.microsoft.com/office/word/2012/wordml" xmlns:w16cex="http://schemas.microsoft.com/office/word/2018/wordml/cex" xmlns:w16cid="http://schemas.microsoft.com/office/word/2016/wordml/cid" xmlns:w16="http://schemas.microsoft.com/office/word/2018/wordml" xmlns:w16du="http://schemas.microsoft.com/office/word/2023/wordml/word16du" xmlns:w16sdtdh="http://schemas.microsoft.com/office/word/2020/wordml/sdtdatahash" xmlns:w16sdtfl="http://schemas.microsoft.com/office/word/2024/wordml/sdtformatlock" xmlns:w16se="http://schemas.microsoft.com/office/word/2015/wordml/symex" xmlns:wpg="http://schemas.microsoft.com/office/word/2010/wordprocessingGroup" xmlns:wpi="http://schemas.microsoft.com/office/word/2010/wordprocessingInk" xmlns:wne="http://schemas.microsoft.com/office/word/2006/wordml" xmlns:wps="http://schemas.microsoft.com/office/word/2010/wordprocessingShape" mc:Ignorable="w14 w15 w16se w16cid w16 w16cex w16sdtdh w16sdtfl w16du wp14">
   <w:endnote w:type="separator" w:id="-1">
     <w:p>
       <w:pPr>
@@ -9910,23 +10019,23 @@
 </file>
 
 <file path=word/footer1.xml><?xml version="1.0" encoding="utf-8"?>
-<w:ftr xmlns:wpc="http://schemas.microsoft.com/office/word/2010/wordprocessingCanvas" xmlns:cx="http://schemas.microsoft.com/office/drawing/2014/chartex" xmlns:cx1="http://schemas.microsoft.com/office/drawing/2015/9/8/chartex" xmlns:cx2="http://schemas.microsoft.com/office/drawing/2015/10/21/chartex" xmlns:cx3="http://schemas.microsoft.com/office/drawing/2016/5/9/chartex" xmlns:cx4="http://schemas.microsoft.com/office/drawing/2016/5/10/chartex" xmlns:cx5="http://schemas.microsoft.com/office/drawing/2016/5/11/chartex" xmlns:cx6="http://schemas.microsoft.com/office/drawing/2016/5/12/chartex" xmlns:cx7="http://schemas.microsoft.com/office/drawing/2016/5/13/chartex" xmlns:cx8="http://schemas.microsoft.com/office/drawing/2016/5/14/chartex" xmlns:mc="http://schemas.openxmlformats.org/markup-compatibility/2006" xmlns:aink="http://schemas.microsoft.com/office/drawing/2016/ink" xmlns:am3d="http://schemas.microsoft.com/office/drawing/2017/model3d" xmlns:o="urn:schemas-microsoft-com:office:office" xmlns:r="http://schemas.openxmlformats.org/officeDocument/2006/relationships" xmlns:m="http://schemas.openxmlformats.org/officeDocument/2006/math" xmlns:v="urn:schemas-microsoft-com:vml" xmlns:wp14="http://schemas.microsoft.com/office/word/2010/wordprocessingDrawing" xmlns:wp="http://schemas.openxmlformats.org/drawingml/2006/wordprocessingDrawing" xmlns:w10="urn:schemas-microsoft-com:office:word" xmlns:w="http://schemas.openxmlformats.org/wordprocessingml/2006/main" xmlns:w14="http://schemas.microsoft.com/office/word/2010/wordml" xmlns:w15="http://schemas.microsoft.com/office/word/2012/wordml" xmlns:w16cid="http://schemas.microsoft.com/office/word/2016/wordml/cid" xmlns:w16se="http://schemas.microsoft.com/office/word/2015/wordml/symex" xmlns:wpg="http://schemas.microsoft.com/office/word/2010/wordprocessingGroup" xmlns:wpi="http://schemas.microsoft.com/office/word/2010/wordprocessingInk" xmlns:wne="http://schemas.microsoft.com/office/word/2006/wordml" xmlns:wps="http://schemas.microsoft.com/office/word/2010/wordprocessingShape" mc:Ignorable="w14 w15 w16se w16cid wp14">
+<w:ftr xmlns:wpc="http://schemas.microsoft.com/office/word/2010/wordprocessingCanvas" xmlns:cx="http://schemas.microsoft.com/office/drawing/2014/chartex" xmlns:cx1="http://schemas.microsoft.com/office/drawing/2015/9/8/chartex" xmlns:cx2="http://schemas.microsoft.com/office/drawing/2015/10/21/chartex" xmlns:cx3="http://schemas.microsoft.com/office/drawing/2016/5/9/chartex" xmlns:cx4="http://schemas.microsoft.com/office/drawing/2016/5/10/chartex" xmlns:cx5="http://schemas.microsoft.com/office/drawing/2016/5/11/chartex" xmlns:cx6="http://schemas.microsoft.com/office/drawing/2016/5/12/chartex" xmlns:cx7="http://schemas.microsoft.com/office/drawing/2016/5/13/chartex" xmlns:cx8="http://schemas.microsoft.com/office/drawing/2016/5/14/chartex" xmlns:mc="http://schemas.openxmlformats.org/markup-compatibility/2006" xmlns:aink="http://schemas.microsoft.com/office/drawing/2016/ink" xmlns:am3d="http://schemas.microsoft.com/office/drawing/2017/model3d" xmlns:o="urn:schemas-microsoft-com:office:office" xmlns:oel="http://schemas.microsoft.com/office/2019/extlst" xmlns:r="http://schemas.openxmlformats.org/officeDocument/2006/relationships" xmlns:m="http://schemas.openxmlformats.org/officeDocument/2006/math" xmlns:v="urn:schemas-microsoft-com:vml" xmlns:wp14="http://schemas.microsoft.com/office/word/2010/wordprocessingDrawing" xmlns:wp="http://schemas.openxmlformats.org/drawingml/2006/wordprocessingDrawing" xmlns:w10="urn:schemas-microsoft-com:office:word" xmlns:w="http://schemas.openxmlformats.org/wordprocessingml/2006/main" xmlns:w14="http://schemas.microsoft.com/office/word/2010/wordml" xmlns:w15="http://schemas.microsoft.com/office/word/2012/wordml" xmlns:w16cex="http://schemas.microsoft.com/office/word/2018/wordml/cex" xmlns:w16cid="http://schemas.microsoft.com/office/word/2016/wordml/cid" xmlns:w16="http://schemas.microsoft.com/office/word/2018/wordml" xmlns:w16du="http://schemas.microsoft.com/office/word/2023/wordml/word16du" xmlns:w16sdtdh="http://schemas.microsoft.com/office/word/2020/wordml/sdtdatahash" xmlns:w16sdtfl="http://schemas.microsoft.com/office/word/2024/wordml/sdtformatlock" xmlns:w16se="http://schemas.microsoft.com/office/word/2015/wordml/symex" xmlns:wpg="http://schemas.microsoft.com/office/word/2010/wordprocessingGroup" xmlns:wpi="http://schemas.microsoft.com/office/word/2010/wordprocessingInk" xmlns:wne="http://schemas.microsoft.com/office/word/2006/wordml" xmlns:wps="http://schemas.microsoft.com/office/word/2010/wordprocessingShape" mc:Ignorable="w14 w15 w16se w16cid w16 w16cex w16sdtdh w16sdtfl w16du wp14">
   <w:p>
     <w:pPr>
-      <w:pStyle w:val="Footer"/>
+      <w:pStyle w:val="Chntrang"/>
       <w:jc w:val="right"/>
     </w:pPr>
   </w:p>
   <w:p>
     <w:pPr>
-      <w:pStyle w:val="Footer"/>
+      <w:pStyle w:val="Chntrang"/>
     </w:pPr>
   </w:p>
 </w:ftr>
 </file>
 
 <file path=word/footer2.xml><?xml version="1.0" encoding="utf-8"?>
-<w:ftr xmlns:wpc="http://schemas.microsoft.com/office/word/2010/wordprocessingCanvas" xmlns:cx="http://schemas.microsoft.com/office/drawing/2014/chartex" xmlns:cx1="http://schemas.microsoft.com/office/drawing/2015/9/8/chartex" xmlns:cx2="http://schemas.microsoft.com/office/drawing/2015/10/21/chartex" xmlns:cx3="http://schemas.microsoft.com/office/drawing/2016/5/9/chartex" xmlns:cx4="http://schemas.microsoft.com/office/drawing/2016/5/10/chartex" xmlns:cx5="http://schemas.microsoft.com/office/drawing/2016/5/11/chartex" xmlns:cx6="http://schemas.microsoft.com/office/drawing/2016/5/12/chartex" xmlns:cx7="http://schemas.microsoft.com/office/drawing/2016/5/13/chartex" xmlns:cx8="http://schemas.microsoft.com/office/drawing/2016/5/14/chartex" xmlns:mc="http://schemas.openxmlformats.org/markup-compatibility/2006" xmlns:aink="http://schemas.microsoft.com/office/drawing/2016/ink" xmlns:am3d="http://schemas.microsoft.com/office/drawing/2017/model3d" xmlns:o="urn:schemas-microsoft-com:office:office" xmlns:r="http://schemas.openxmlformats.org/officeDocument/2006/relationships" xmlns:m="http://schemas.openxmlformats.org/officeDocument/2006/math" xmlns:v="urn:schemas-microsoft-com:vml" xmlns:wp14="http://schemas.microsoft.com/office/word/2010/wordprocessingDrawing" xmlns:wp="http://schemas.openxmlformats.org/drawingml/2006/wordprocessingDrawing" xmlns:w10="urn:schemas-microsoft-com:office:word" xmlns:w="http://schemas.openxmlformats.org/wordprocessingml/2006/main" xmlns:w14="http://schemas.microsoft.com/office/word/2010/wordml" xmlns:w15="http://schemas.microsoft.com/office/word/2012/wordml" xmlns:w16cid="http://schemas.microsoft.com/office/word/2016/wordml/cid" xmlns:w16se="http://schemas.microsoft.com/office/word/2015/wordml/symex" xmlns:wpg="http://schemas.microsoft.com/office/word/2010/wordprocessingGroup" xmlns:wpi="http://schemas.microsoft.com/office/word/2010/wordprocessingInk" xmlns:wne="http://schemas.microsoft.com/office/word/2006/wordml" xmlns:wps="http://schemas.microsoft.com/office/word/2010/wordprocessingShape" mc:Ignorable="w14 w15 w16se w16cid wp14">
+<w:ftr xmlns:wpc="http://schemas.microsoft.com/office/word/2010/wordprocessingCanvas" xmlns:cx="http://schemas.microsoft.com/office/drawing/2014/chartex" xmlns:cx1="http://schemas.microsoft.com/office/drawing/2015/9/8/chartex" xmlns:cx2="http://schemas.microsoft.com/office/drawing/2015/10/21/chartex" xmlns:cx3="http://schemas.microsoft.com/office/drawing/2016/5/9/chartex" xmlns:cx4="http://schemas.microsoft.com/office/drawing/2016/5/10/chartex" xmlns:cx5="http://schemas.microsoft.com/office/drawing/2016/5/11/chartex" xmlns:cx6="http://schemas.microsoft.com/office/drawing/2016/5/12/chartex" xmlns:cx7="http://schemas.microsoft.com/office/drawing/2016/5/13/chartex" xmlns:cx8="http://schemas.microsoft.com/office/drawing/2016/5/14/chartex" xmlns:mc="http://schemas.openxmlformats.org/markup-compatibility/2006" xmlns:aink="http://schemas.microsoft.com/office/drawing/2016/ink" xmlns:am3d="http://schemas.microsoft.com/office/drawing/2017/model3d" xmlns:o="urn:schemas-microsoft-com:office:office" xmlns:oel="http://schemas.microsoft.com/office/2019/extlst" xmlns:r="http://schemas.openxmlformats.org/officeDocument/2006/relationships" xmlns:m="http://schemas.openxmlformats.org/officeDocument/2006/math" xmlns:v="urn:schemas-microsoft-com:vml" xmlns:wp14="http://schemas.microsoft.com/office/word/2010/wordprocessingDrawing" xmlns:wp="http://schemas.openxmlformats.org/drawingml/2006/wordprocessingDrawing" xmlns:w10="urn:schemas-microsoft-com:office:word" xmlns:w="http://schemas.openxmlformats.org/wordprocessingml/2006/main" xmlns:w14="http://schemas.microsoft.com/office/word/2010/wordml" xmlns:w15="http://schemas.microsoft.com/office/word/2012/wordml" xmlns:w16cex="http://schemas.microsoft.com/office/word/2018/wordml/cex" xmlns:w16cid="http://schemas.microsoft.com/office/word/2016/wordml/cid" xmlns:w16="http://schemas.microsoft.com/office/word/2018/wordml" xmlns:w16du="http://schemas.microsoft.com/office/word/2023/wordml/word16du" xmlns:w16sdtdh="http://schemas.microsoft.com/office/word/2020/wordml/sdtdatahash" xmlns:w16sdtfl="http://schemas.microsoft.com/office/word/2024/wordml/sdtformatlock" xmlns:w16se="http://schemas.microsoft.com/office/word/2015/wordml/symex" xmlns:wpg="http://schemas.microsoft.com/office/word/2010/wordprocessingGroup" xmlns:wpi="http://schemas.microsoft.com/office/word/2010/wordprocessingInk" xmlns:wne="http://schemas.microsoft.com/office/word/2006/wordml" xmlns:wps="http://schemas.microsoft.com/office/word/2010/wordprocessingShape" mc:Ignorable="w14 w15 w16se w16cid w16 w16cex w16sdtdh w16sdtfl w16du wp14">
   <w:sdt>
     <w:sdtPr>
       <w:id w:val="1872029562"/>
@@ -9943,7 +10052,7 @@
     <w:sdtContent>
       <w:p>
         <w:pPr>
-          <w:pStyle w:val="Footer"/>
+          <w:pStyle w:val="Chntrang"/>
           <w:pBdr>
             <w:top w:val="single" w:sz="4" w:space="1" w:color="auto"/>
           </w:pBdr>
@@ -9975,14 +10084,14 @@
   </w:sdt>
   <w:p>
     <w:pPr>
-      <w:pStyle w:val="Footer"/>
+      <w:pStyle w:val="Chntrang"/>
     </w:pPr>
   </w:p>
 </w:ftr>
 </file>
 
 <file path=word/footnotes.xml><?xml version="1.0" encoding="utf-8"?>
-<w:footnotes xmlns:wpc="http://schemas.microsoft.com/office/word/2010/wordprocessingCanvas" xmlns:cx="http://schemas.microsoft.com/office/drawing/2014/chartex" xmlns:cx1="http://schemas.microsoft.com/office/drawing/2015/9/8/chartex" xmlns:cx2="http://schemas.microsoft.com/office/drawing/2015/10/21/chartex" xmlns:cx3="http://schemas.microsoft.com/office/drawing/2016/5/9/chartex" xmlns:cx4="http://schemas.microsoft.com/office/drawing/2016/5/10/chartex" xmlns:cx5="http://schemas.microsoft.com/office/drawing/2016/5/11/chartex" xmlns:cx6="http://schemas.microsoft.com/office/drawing/2016/5/12/chartex" xmlns:cx7="http://schemas.microsoft.com/office/drawing/2016/5/13/chartex" xmlns:cx8="http://schemas.microsoft.com/office/drawing/2016/5/14/chartex" xmlns:mc="http://schemas.openxmlformats.org/markup-compatibility/2006" xmlns:aink="http://schemas.microsoft.com/office/drawing/2016/ink" xmlns:am3d="http://schemas.microsoft.com/office/drawing/2017/model3d" xmlns:o="urn:schemas-microsoft-com:office:office" xmlns:r="http://schemas.openxmlformats.org/officeDocument/2006/relationships" xmlns:m="http://schemas.openxmlformats.org/officeDocument/2006/math" xmlns:v="urn:schemas-microsoft-com:vml" xmlns:wp14="http://schemas.microsoft.com/office/word/2010/wordprocessingDrawing" xmlns:wp="http://schemas.openxmlformats.org/drawingml/2006/wordprocessingDrawing" xmlns:w10="urn:schemas-microsoft-com:office:word" xmlns:w="http://schemas.openxmlformats.org/wordprocessingml/2006/main" xmlns:w14="http://schemas.microsoft.com/office/word/2010/wordml" xmlns:w15="http://schemas.microsoft.com/office/word/2012/wordml" xmlns:w16cid="http://schemas.microsoft.com/office/word/2016/wordml/cid" xmlns:w16se="http://schemas.microsoft.com/office/word/2015/wordml/symex" xmlns:wpg="http://schemas.microsoft.com/office/word/2010/wordprocessingGroup" xmlns:wpi="http://schemas.microsoft.com/office/word/2010/wordprocessingInk" xmlns:wne="http://schemas.microsoft.com/office/word/2006/wordml" xmlns:wps="http://schemas.microsoft.com/office/word/2010/wordprocessingShape" mc:Ignorable="w14 w15 w16se w16cid wp14">
+<w:footnotes xmlns:wpc="http://schemas.microsoft.com/office/word/2010/wordprocessingCanvas" xmlns:cx="http://schemas.microsoft.com/office/drawing/2014/chartex" xmlns:cx1="http://schemas.microsoft.com/office/drawing/2015/9/8/chartex" xmlns:cx2="http://schemas.microsoft.com/office/drawing/2015/10/21/chartex" xmlns:cx3="http://schemas.microsoft.com/office/drawing/2016/5/9/chartex" xmlns:cx4="http://schemas.microsoft.com/office/drawing/2016/5/10/chartex" xmlns:cx5="http://schemas.microsoft.com/office/drawing/2016/5/11/chartex" xmlns:cx6="http://schemas.microsoft.com/office/drawing/2016/5/12/chartex" xmlns:cx7="http://schemas.microsoft.com/office/drawing/2016/5/13/chartex" xmlns:cx8="http://schemas.microsoft.com/office/drawing/2016/5/14/chartex" xmlns:mc="http://schemas.openxmlformats.org/markup-compatibility/2006" xmlns:aink="http://schemas.microsoft.com/office/drawing/2016/ink" xmlns:am3d="http://schemas.microsoft.com/office/drawing/2017/model3d" xmlns:o="urn:schemas-microsoft-com:office:office" xmlns:oel="http://schemas.microsoft.com/office/2019/extlst" xmlns:r="http://schemas.openxmlformats.org/officeDocument/2006/relationships" xmlns:m="http://schemas.openxmlformats.org/officeDocument/2006/math" xmlns:v="urn:schemas-microsoft-com:vml" xmlns:wp14="http://schemas.microsoft.com/office/word/2010/wordprocessingDrawing" xmlns:wp="http://schemas.openxmlformats.org/drawingml/2006/wordprocessingDrawing" xmlns:w10="urn:schemas-microsoft-com:office:word" xmlns:w="http://schemas.openxmlformats.org/wordprocessingml/2006/main" xmlns:w14="http://schemas.microsoft.com/office/word/2010/wordml" xmlns:w15="http://schemas.microsoft.com/office/word/2012/wordml" xmlns:w16cex="http://schemas.microsoft.com/office/word/2018/wordml/cex" xmlns:w16cid="http://schemas.microsoft.com/office/word/2016/wordml/cid" xmlns:w16="http://schemas.microsoft.com/office/word/2018/wordml" xmlns:w16du="http://schemas.microsoft.com/office/word/2023/wordml/word16du" xmlns:w16sdtdh="http://schemas.microsoft.com/office/word/2020/wordml/sdtdatahash" xmlns:w16sdtfl="http://schemas.microsoft.com/office/word/2024/wordml/sdtformatlock" xmlns:w16se="http://schemas.microsoft.com/office/word/2015/wordml/symex" xmlns:wpg="http://schemas.microsoft.com/office/word/2010/wordprocessingGroup" xmlns:wpi="http://schemas.microsoft.com/office/word/2010/wordprocessingInk" xmlns:wne="http://schemas.microsoft.com/office/word/2006/wordml" xmlns:wps="http://schemas.microsoft.com/office/word/2010/wordprocessingShape" mc:Ignorable="w14 w15 w16se w16cid w16 w16cex w16sdtdh w16sdtfl w16du wp14">
   <w:footnote w:type="separator" w:id="-1">
     <w:p>
       <w:pPr>
@@ -10007,10 +10116,10 @@
 </file>
 
 <file path=word/header1.xml><?xml version="1.0" encoding="utf-8"?>
-<w:hdr xmlns:wpc="http://schemas.microsoft.com/office/word/2010/wordprocessingCanvas" xmlns:cx="http://schemas.microsoft.com/office/drawing/2014/chartex" xmlns:cx1="http://schemas.microsoft.com/office/drawing/2015/9/8/chartex" xmlns:cx2="http://schemas.microsoft.com/office/drawing/2015/10/21/chartex" xmlns:cx3="http://schemas.microsoft.com/office/drawing/2016/5/9/chartex" xmlns:cx4="http://schemas.microsoft.com/office/drawing/2016/5/10/chartex" xmlns:cx5="http://schemas.microsoft.com/office/drawing/2016/5/11/chartex" xmlns:cx6="http://schemas.microsoft.com/office/drawing/2016/5/12/chartex" xmlns:cx7="http://schemas.microsoft.com/office/drawing/2016/5/13/chartex" xmlns:cx8="http://schemas.microsoft.com/office/drawing/2016/5/14/chartex" xmlns:mc="http://schemas.openxmlformats.org/markup-compatibility/2006" xmlns:aink="http://schemas.microsoft.com/office/drawing/2016/ink" xmlns:am3d="http://schemas.microsoft.com/office/drawing/2017/model3d" xmlns:o="urn:schemas-microsoft-com:office:office" xmlns:r="http://schemas.openxmlformats.org/officeDocument/2006/relationships" xmlns:m="http://schemas.openxmlformats.org/officeDocument/2006/math" xmlns:v="urn:schemas-microsoft-com:vml" xmlns:wp14="http://schemas.microsoft.com/office/word/2010/wordprocessingDrawing" xmlns:wp="http://schemas.openxmlformats.org/drawingml/2006/wordprocessingDrawing" xmlns:w10="urn:schemas-microsoft-com:office:word" xmlns:w="http://schemas.openxmlformats.org/wordprocessingml/2006/main" xmlns:w14="http://schemas.microsoft.com/office/word/2010/wordml" xmlns:w15="http://schemas.microsoft.com/office/word/2012/wordml" xmlns:w16cid="http://schemas.microsoft.com/office/word/2016/wordml/cid" xmlns:w16se="http://schemas.microsoft.com/office/word/2015/wordml/symex" xmlns:wpg="http://schemas.microsoft.com/office/word/2010/wordprocessingGroup" xmlns:wpi="http://schemas.microsoft.com/office/word/2010/wordprocessingInk" xmlns:wne="http://schemas.microsoft.com/office/word/2006/wordml" xmlns:wps="http://schemas.microsoft.com/office/word/2010/wordprocessingShape" mc:Ignorable="w14 w15 w16se w16cid wp14">
+<w:hdr xmlns:wpc="http://schemas.microsoft.com/office/word/2010/wordprocessingCanvas" xmlns:cx="http://schemas.microsoft.com/office/drawing/2014/chartex" xmlns:cx1="http://schemas.microsoft.com/office/drawing/2015/9/8/chartex" xmlns:cx2="http://schemas.microsoft.com/office/drawing/2015/10/21/chartex" xmlns:cx3="http://schemas.microsoft.com/office/drawing/2016/5/9/chartex" xmlns:cx4="http://schemas.microsoft.com/office/drawing/2016/5/10/chartex" xmlns:cx5="http://schemas.microsoft.com/office/drawing/2016/5/11/chartex" xmlns:cx6="http://schemas.microsoft.com/office/drawing/2016/5/12/chartex" xmlns:cx7="http://schemas.microsoft.com/office/drawing/2016/5/13/chartex" xmlns:cx8="http://schemas.microsoft.com/office/drawing/2016/5/14/chartex" xmlns:mc="http://schemas.openxmlformats.org/markup-compatibility/2006" xmlns:aink="http://schemas.microsoft.com/office/drawing/2016/ink" xmlns:am3d="http://schemas.microsoft.com/office/drawing/2017/model3d" xmlns:o="urn:schemas-microsoft-com:office:office" xmlns:oel="http://schemas.microsoft.com/office/2019/extlst" xmlns:r="http://schemas.openxmlformats.org/officeDocument/2006/relationships" xmlns:m="http://schemas.openxmlformats.org/officeDocument/2006/math" xmlns:v="urn:schemas-microsoft-com:vml" xmlns:wp14="http://schemas.microsoft.com/office/word/2010/wordprocessingDrawing" xmlns:wp="http://schemas.openxmlformats.org/drawingml/2006/wordprocessingDrawing" xmlns:w10="urn:schemas-microsoft-com:office:word" xmlns:w="http://schemas.openxmlformats.org/wordprocessingml/2006/main" xmlns:w14="http://schemas.microsoft.com/office/word/2010/wordml" xmlns:w15="http://schemas.microsoft.com/office/word/2012/wordml" xmlns:w16cex="http://schemas.microsoft.com/office/word/2018/wordml/cex" xmlns:w16cid="http://schemas.microsoft.com/office/word/2016/wordml/cid" xmlns:w16="http://schemas.microsoft.com/office/word/2018/wordml" xmlns:w16du="http://schemas.microsoft.com/office/word/2023/wordml/word16du" xmlns:w16sdtdh="http://schemas.microsoft.com/office/word/2020/wordml/sdtdatahash" xmlns:w16sdtfl="http://schemas.microsoft.com/office/word/2024/wordml/sdtformatlock" xmlns:w16se="http://schemas.microsoft.com/office/word/2015/wordml/symex" xmlns:wpg="http://schemas.microsoft.com/office/word/2010/wordprocessingGroup" xmlns:wpi="http://schemas.microsoft.com/office/word/2010/wordprocessingInk" xmlns:wne="http://schemas.microsoft.com/office/word/2006/wordml" xmlns:wps="http://schemas.microsoft.com/office/word/2010/wordprocessingShape" mc:Ignorable="w14 w15 w16se w16cid w16 w16cex w16sdtdh w16sdtfl w16du wp14">
   <w:p>
     <w:pPr>
-      <w:pStyle w:val="Header"/>
+      <w:pStyle w:val="utrang"/>
       <w:pBdr>
         <w:bottom w:val="single" w:sz="4" w:space="1" w:color="auto"/>
       </w:pBdr>
@@ -10044,7 +10153,7 @@
 </file>
 
 <file path=word/numbering.xml><?xml version="1.0" encoding="utf-8"?>
-<w:numbering xmlns:wpc="http://schemas.microsoft.com/office/word/2010/wordprocessingCanvas" xmlns:cx="http://schemas.microsoft.com/office/drawing/2014/chartex" xmlns:cx1="http://schemas.microsoft.com/office/drawing/2015/9/8/chartex" xmlns:cx2="http://schemas.microsoft.com/office/drawing/2015/10/21/chartex" xmlns:cx3="http://schemas.microsoft.com/office/drawing/2016/5/9/chartex" xmlns:cx4="http://schemas.microsoft.com/office/drawing/2016/5/10/chartex" xmlns:cx5="http://schemas.microsoft.com/office/drawing/2016/5/11/chartex" xmlns:cx6="http://schemas.microsoft.com/office/drawing/2016/5/12/chartex" xmlns:cx7="http://schemas.microsoft.com/office/drawing/2016/5/13/chartex" xmlns:cx8="http://schemas.microsoft.com/office/drawing/2016/5/14/chartex" xmlns:mc="http://schemas.openxmlformats.org/markup-compatibility/2006" xmlns:aink="http://schemas.microsoft.com/office/drawing/2016/ink" xmlns:am3d="http://schemas.microsoft.com/office/drawing/2017/model3d" xmlns:o="urn:schemas-microsoft-com:office:office" xmlns:r="http://schemas.openxmlformats.org/officeDocument/2006/relationships" xmlns:m="http://schemas.openxmlformats.org/officeDocument/2006/math" xmlns:v="urn:schemas-microsoft-com:vml" xmlns:wp14="http://schemas.microsoft.com/office/word/2010/wordprocessingDrawing" xmlns:wp="http://schemas.openxmlformats.org/drawingml/2006/wordprocessingDrawing" xmlns:w10="urn:schemas-microsoft-com:office:word" xmlns:w="http://schemas.openxmlformats.org/wordprocessingml/2006/main" xmlns:w14="http://schemas.microsoft.com/office/word/2010/wordml" xmlns:w15="http://schemas.microsoft.com/office/word/2012/wordml" xmlns:w16cid="http://schemas.microsoft.com/office/word/2016/wordml/cid" xmlns:w16se="http://schemas.microsoft.com/office/word/2015/wordml/symex" xmlns:wpg="http://schemas.microsoft.com/office/word/2010/wordprocessingGroup" xmlns:wpi="http://schemas.microsoft.com/office/word/2010/wordprocessingInk" xmlns:wne="http://schemas.microsoft.com/office/word/2006/wordml" xmlns:wps="http://schemas.microsoft.com/office/word/2010/wordprocessingShape" mc:Ignorable="w14 w15 w16se w16cid wp14">
+<w:numbering xmlns:wpc="http://schemas.microsoft.com/office/word/2010/wordprocessingCanvas" xmlns:cx="http://schemas.microsoft.com/office/drawing/2014/chartex" xmlns:cx1="http://schemas.microsoft.com/office/drawing/2015/9/8/chartex" xmlns:cx2="http://schemas.microsoft.com/office/drawing/2015/10/21/chartex" xmlns:cx3="http://schemas.microsoft.com/office/drawing/2016/5/9/chartex" xmlns:cx4="http://schemas.microsoft.com/office/drawing/2016/5/10/chartex" xmlns:cx5="http://schemas.microsoft.com/office/drawing/2016/5/11/chartex" xmlns:cx6="http://schemas.microsoft.com/office/drawing/2016/5/12/chartex" xmlns:cx7="http://schemas.microsoft.com/office/drawing/2016/5/13/chartex" xmlns:cx8="http://schemas.microsoft.com/office/drawing/2016/5/14/chartex" xmlns:mc="http://schemas.openxmlformats.org/markup-compatibility/2006" xmlns:aink="http://schemas.microsoft.com/office/drawing/2016/ink" xmlns:am3d="http://schemas.microsoft.com/office/drawing/2017/model3d" xmlns:o="urn:schemas-microsoft-com:office:office" xmlns:oel="http://schemas.microsoft.com/office/2019/extlst" xmlns:r="http://schemas.openxmlformats.org/officeDocument/2006/relationships" xmlns:m="http://schemas.openxmlformats.org/officeDocument/2006/math" xmlns:v="urn:schemas-microsoft-com:vml" xmlns:wp14="http://schemas.microsoft.com/office/word/2010/wordprocessingDrawing" xmlns:wp="http://schemas.openxmlformats.org/drawingml/2006/wordprocessingDrawing" xmlns:w10="urn:schemas-microsoft-com:office:word" xmlns:w="http://schemas.openxmlformats.org/wordprocessingml/2006/main" xmlns:w14="http://schemas.microsoft.com/office/word/2010/wordml" xmlns:w15="http://schemas.microsoft.com/office/word/2012/wordml" xmlns:w16cex="http://schemas.microsoft.com/office/word/2018/wordml/cex" xmlns:w16cid="http://schemas.microsoft.com/office/word/2016/wordml/cid" xmlns:w16="http://schemas.microsoft.com/office/word/2018/wordml" xmlns:w16du="http://schemas.microsoft.com/office/word/2023/wordml/word16du" xmlns:w16sdtdh="http://schemas.microsoft.com/office/word/2020/wordml/sdtdatahash" xmlns:w16sdtfl="http://schemas.microsoft.com/office/word/2024/wordml/sdtformatlock" xmlns:w16se="http://schemas.microsoft.com/office/word/2015/wordml/symex" xmlns:wpg="http://schemas.microsoft.com/office/word/2010/wordprocessingGroup" xmlns:wpi="http://schemas.microsoft.com/office/word/2010/wordprocessingInk" xmlns:wne="http://schemas.microsoft.com/office/word/2006/wordml" xmlns:wps="http://schemas.microsoft.com/office/word/2010/wordprocessingShape" mc:Ignorable="w14 w15 w16se w16cid w16 w16cex w16sdtdh w16sdtfl w16du wp14">
   <w:abstractNum w:abstractNumId="0" w15:restartNumberingAfterBreak="0">
     <w:nsid w:val="82558D21"/>
     <w:multiLevelType w:val="multilevel"/>
@@ -15041,137 +15150,137 @@
       </w:rPr>
     </w:lvl>
   </w:abstractNum>
-  <w:num w:numId="1">
+  <w:num w:numId="1" w16cid:durableId="1217357262">
     <w:abstractNumId w:val="0"/>
   </w:num>
-  <w:num w:numId="2">
+  <w:num w:numId="2" w16cid:durableId="238297022">
     <w:abstractNumId w:val="22"/>
   </w:num>
-  <w:num w:numId="3">
+  <w:num w:numId="3" w16cid:durableId="1490056308">
     <w:abstractNumId w:val="29"/>
   </w:num>
-  <w:num w:numId="4">
+  <w:num w:numId="4" w16cid:durableId="900406916">
     <w:abstractNumId w:val="20"/>
   </w:num>
-  <w:num w:numId="5">
+  <w:num w:numId="5" w16cid:durableId="2031027737">
     <w:abstractNumId w:val="11"/>
   </w:num>
-  <w:num w:numId="6">
+  <w:num w:numId="6" w16cid:durableId="93787997">
     <w:abstractNumId w:val="18"/>
   </w:num>
-  <w:num w:numId="7">
+  <w:num w:numId="7" w16cid:durableId="1949727106">
     <w:abstractNumId w:val="9"/>
   </w:num>
-  <w:num w:numId="8">
+  <w:num w:numId="8" w16cid:durableId="118426345">
     <w:abstractNumId w:val="35"/>
   </w:num>
-  <w:num w:numId="9">
+  <w:num w:numId="9" w16cid:durableId="239100586">
     <w:abstractNumId w:val="10"/>
   </w:num>
-  <w:num w:numId="10">
+  <w:num w:numId="10" w16cid:durableId="1078481425">
     <w:abstractNumId w:val="28"/>
   </w:num>
-  <w:num w:numId="11">
+  <w:num w:numId="11" w16cid:durableId="2034718920">
     <w:abstractNumId w:val="39"/>
   </w:num>
-  <w:num w:numId="12">
+  <w:num w:numId="12" w16cid:durableId="1654672661">
     <w:abstractNumId w:val="24"/>
   </w:num>
-  <w:num w:numId="13">
+  <w:num w:numId="13" w16cid:durableId="1086536380">
     <w:abstractNumId w:val="12"/>
   </w:num>
-  <w:num w:numId="14">
+  <w:num w:numId="14" w16cid:durableId="431780873">
     <w:abstractNumId w:val="15"/>
   </w:num>
-  <w:num w:numId="15">
+  <w:num w:numId="15" w16cid:durableId="449708064">
     <w:abstractNumId w:val="1"/>
   </w:num>
-  <w:num w:numId="16">
+  <w:num w:numId="16" w16cid:durableId="302271208">
     <w:abstractNumId w:val="8"/>
   </w:num>
-  <w:num w:numId="17">
+  <w:num w:numId="17" w16cid:durableId="1253005525">
     <w:abstractNumId w:val="38"/>
   </w:num>
-  <w:num w:numId="18">
+  <w:num w:numId="18" w16cid:durableId="413286015">
     <w:abstractNumId w:val="34"/>
   </w:num>
-  <w:num w:numId="19">
+  <w:num w:numId="19" w16cid:durableId="1409420808">
     <w:abstractNumId w:val="37"/>
   </w:num>
-  <w:num w:numId="20">
+  <w:num w:numId="20" w16cid:durableId="872809172">
     <w:abstractNumId w:val="2"/>
   </w:num>
-  <w:num w:numId="21">
+  <w:num w:numId="21" w16cid:durableId="2120373437">
     <w:abstractNumId w:val="6"/>
   </w:num>
-  <w:num w:numId="22">
+  <w:num w:numId="22" w16cid:durableId="2015306276">
     <w:abstractNumId w:val="27"/>
   </w:num>
-  <w:num w:numId="23">
+  <w:num w:numId="23" w16cid:durableId="401216095">
     <w:abstractNumId w:val="14"/>
   </w:num>
-  <w:num w:numId="24">
+  <w:num w:numId="24" w16cid:durableId="400563575">
     <w:abstractNumId w:val="25"/>
   </w:num>
-  <w:num w:numId="25">
+  <w:num w:numId="25" w16cid:durableId="838890448">
     <w:abstractNumId w:val="4"/>
   </w:num>
-  <w:num w:numId="26">
+  <w:num w:numId="26" w16cid:durableId="1451238330">
     <w:abstractNumId w:val="13"/>
   </w:num>
-  <w:num w:numId="27">
+  <w:num w:numId="27" w16cid:durableId="164588080">
     <w:abstractNumId w:val="5"/>
   </w:num>
-  <w:num w:numId="28">
+  <w:num w:numId="28" w16cid:durableId="1835729852">
     <w:abstractNumId w:val="21"/>
   </w:num>
-  <w:num w:numId="29">
+  <w:num w:numId="29" w16cid:durableId="2090736217">
     <w:abstractNumId w:val="32"/>
   </w:num>
-  <w:num w:numId="30">
+  <w:num w:numId="30" w16cid:durableId="342632352">
     <w:abstractNumId w:val="33"/>
   </w:num>
-  <w:num w:numId="31">
+  <w:num w:numId="31" w16cid:durableId="1452482348">
     <w:abstractNumId w:val="7"/>
   </w:num>
-  <w:num w:numId="32">
+  <w:num w:numId="32" w16cid:durableId="600572105">
     <w:abstractNumId w:val="40"/>
   </w:num>
-  <w:num w:numId="33">
+  <w:num w:numId="33" w16cid:durableId="1455176126">
     <w:abstractNumId w:val="23"/>
   </w:num>
-  <w:num w:numId="34">
+  <w:num w:numId="34" w16cid:durableId="1557929177">
     <w:abstractNumId w:val="16"/>
   </w:num>
-  <w:num w:numId="35">
+  <w:num w:numId="35" w16cid:durableId="545029714">
     <w:abstractNumId w:val="36"/>
   </w:num>
-  <w:num w:numId="36">
+  <w:num w:numId="36" w16cid:durableId="1685738967">
     <w:abstractNumId w:val="30"/>
   </w:num>
-  <w:num w:numId="37">
+  <w:num w:numId="37" w16cid:durableId="583491010">
     <w:abstractNumId w:val="19"/>
   </w:num>
-  <w:num w:numId="38">
+  <w:num w:numId="38" w16cid:durableId="1583181047">
     <w:abstractNumId w:val="17"/>
   </w:num>
-  <w:num w:numId="39">
+  <w:num w:numId="39" w16cid:durableId="376592925">
     <w:abstractNumId w:val="31"/>
   </w:num>
-  <w:num w:numId="40">
+  <w:num w:numId="40" w16cid:durableId="2092581446">
     <w:abstractNumId w:val="3"/>
   </w:num>
-  <w:num w:numId="41">
+  <w:num w:numId="41" w16cid:durableId="274366035">
     <w:abstractNumId w:val="41"/>
   </w:num>
-  <w:num w:numId="42">
+  <w:num w:numId="42" w16cid:durableId="1493646194">
     <w:abstractNumId w:val="26"/>
   </w:num>
 </w:numbering>
 </file>
 
 <file path=word/styles.xml><?xml version="1.0" encoding="utf-8"?>
-<w:styles xmlns:mc="http://schemas.openxmlformats.org/markup-compatibility/2006" xmlns:r="http://schemas.openxmlformats.org/officeDocument/2006/relationships" xmlns:w="http://schemas.openxmlformats.org/wordprocessingml/2006/main" xmlns:w14="http://schemas.microsoft.com/office/word/2010/wordml" xmlns:w15="http://schemas.microsoft.com/office/word/2012/wordml" xmlns:w16cid="http://schemas.microsoft.com/office/word/2016/wordml/cid" xmlns:w16se="http://schemas.microsoft.com/office/word/2015/wordml/symex" mc:Ignorable="w14 w15 w16se w16cid">
+<w:styles xmlns:mc="http://schemas.openxmlformats.org/markup-compatibility/2006" xmlns:r="http://schemas.openxmlformats.org/officeDocument/2006/relationships" xmlns:w="http://schemas.openxmlformats.org/wordprocessingml/2006/main" xmlns:w14="http://schemas.microsoft.com/office/word/2010/wordml" xmlns:w15="http://schemas.microsoft.com/office/word/2012/wordml" xmlns:w16cex="http://schemas.microsoft.com/office/word/2018/wordml/cex" xmlns:w16cid="http://schemas.microsoft.com/office/word/2016/wordml/cid" xmlns:w16="http://schemas.microsoft.com/office/word/2018/wordml" xmlns:w16du="http://schemas.microsoft.com/office/word/2023/wordml/word16du" xmlns:w16sdtdh="http://schemas.microsoft.com/office/word/2020/wordml/sdtdatahash" xmlns:w16sdtfl="http://schemas.microsoft.com/office/word/2024/wordml/sdtformatlock" xmlns:w16se="http://schemas.microsoft.com/office/word/2015/wordml/symex" mc:Ignorable="w14 w15 w16se w16cid w16 w16cex w16sdtdh w16sdtfl w16du">
   <w:docDefaults>
     <w:rPrDefault>
       <w:rPr>
@@ -15185,7 +15294,7 @@
       </w:pPr>
     </w:pPrDefault>
   </w:docDefaults>
-  <w:latentStyles w:defLockedState="0" w:defUIPriority="0" w:defSemiHidden="0" w:defUnhideWhenUsed="0" w:defQFormat="0" w:count="375">
+  <w:latentStyles w:defLockedState="0" w:defUIPriority="0" w:defSemiHidden="0" w:defUnhideWhenUsed="0" w:defQFormat="0" w:count="376">
     <w:lsdException w:name="Normal" w:qFormat="1"/>
     <w:lsdException w:name="heading 1" w:qFormat="1"/>
     <w:lsdException w:name="heading 2" w:unhideWhenUsed="1" w:qFormat="1"/>
@@ -15553,8 +15662,9 @@
     <w:lsdException w:name="Smart Hyperlink" w:semiHidden="1" w:uiPriority="99" w:unhideWhenUsed="1"/>
     <w:lsdException w:name="Hashtag" w:semiHidden="1" w:uiPriority="99" w:unhideWhenUsed="1"/>
     <w:lsdException w:name="Unresolved Mention" w:semiHidden="1" w:uiPriority="99" w:unhideWhenUsed="1"/>
+    <w:lsdException w:name="Smart Link" w:semiHidden="1" w:uiPriority="99" w:unhideWhenUsed="1"/>
   </w:latentStyles>
-  <w:style w:type="paragraph" w:default="1" w:styleId="Normal">
+  <w:style w:type="paragraph" w:default="1" w:styleId="Binhthng">
     <w:name w:val="Normal"/>
     <w:qFormat/>
     <w:rPr>
@@ -15562,11 +15672,11 @@
       <w:lang w:eastAsia="zh-CN"/>
     </w:rPr>
   </w:style>
-  <w:style w:type="paragraph" w:styleId="Heading1">
+  <w:style w:type="paragraph" w:styleId="u1">
     <w:name w:val="heading 1"/>
-    <w:basedOn w:val="Normal"/>
-    <w:next w:val="Normal"/>
-    <w:link w:val="Heading1Char"/>
+    <w:basedOn w:val="Binhthng"/>
+    <w:next w:val="Binhthng"/>
+    <w:link w:val="u1Char"/>
     <w:qFormat/>
     <w:rsid w:val="000423EE"/>
     <w:pPr>
@@ -15584,11 +15694,11 @@
       <w:szCs w:val="44"/>
     </w:rPr>
   </w:style>
-  <w:style w:type="paragraph" w:styleId="Heading2">
+  <w:style w:type="paragraph" w:styleId="u2">
     <w:name w:val="heading 2"/>
-    <w:basedOn w:val="Normal"/>
-    <w:next w:val="Normal"/>
-    <w:link w:val="Heading2Char"/>
+    <w:basedOn w:val="Binhthng"/>
+    <w:next w:val="Binhthng"/>
+    <w:link w:val="u2Char"/>
     <w:unhideWhenUsed/>
     <w:qFormat/>
     <w:rsid w:val="00593A56"/>
@@ -15606,11 +15716,11 @@
       <w:szCs w:val="32"/>
     </w:rPr>
   </w:style>
-  <w:style w:type="paragraph" w:styleId="Heading3">
+  <w:style w:type="paragraph" w:styleId="u3">
     <w:name w:val="heading 3"/>
-    <w:basedOn w:val="Normal"/>
-    <w:next w:val="Normal"/>
-    <w:link w:val="Heading3Char"/>
+    <w:basedOn w:val="Binhthng"/>
+    <w:next w:val="Binhthng"/>
+    <w:link w:val="u3Char"/>
     <w:semiHidden/>
     <w:unhideWhenUsed/>
     <w:qFormat/>
@@ -15628,13 +15738,13 @@
       <w:szCs w:val="24"/>
     </w:rPr>
   </w:style>
-  <w:style w:type="character" w:default="1" w:styleId="DefaultParagraphFont">
+  <w:style w:type="character" w:default="1" w:styleId="Phngmcinhcuaoanvn">
     <w:name w:val="Default Paragraph Font"/>
     <w:uiPriority w:val="1"/>
     <w:semiHidden/>
     <w:unhideWhenUsed/>
   </w:style>
-  <w:style w:type="table" w:default="1" w:styleId="TableNormal">
+  <w:style w:type="table" w:default="1" w:styleId="BangThngthng">
     <w:name w:val="Normal Table"/>
     <w:uiPriority w:val="99"/>
     <w:semiHidden/>
@@ -15649,15 +15759,15 @@
       </w:tblCellMar>
     </w:tblPr>
   </w:style>
-  <w:style w:type="numbering" w:default="1" w:styleId="NoList">
+  <w:style w:type="numbering" w:default="1" w:styleId="Khngco">
     <w:name w:val="No List"/>
     <w:uiPriority w:val="99"/>
     <w:semiHidden/>
     <w:unhideWhenUsed/>
   </w:style>
-  <w:style w:type="paragraph" w:styleId="BodyText">
+  <w:style w:type="paragraph" w:styleId="ThnVnban">
     <w:name w:val="Body Text"/>
-    <w:basedOn w:val="Normal"/>
+    <w:basedOn w:val="Binhthng"/>
     <w:uiPriority w:val="1"/>
     <w:qFormat/>
     <w:rPr>
@@ -15665,9 +15775,9 @@
       <w:szCs w:val="26"/>
     </w:rPr>
   </w:style>
-  <w:style w:type="character" w:styleId="Hyperlink">
+  <w:style w:type="character" w:styleId="Siuktni">
     <w:name w:val="Hyperlink"/>
-    <w:basedOn w:val="DefaultParagraphFont"/>
+    <w:basedOn w:val="Phngmcinhcuaoanvn"/>
     <w:uiPriority w:val="99"/>
     <w:unhideWhenUsed/>
     <w:qFormat/>
@@ -15678,13 +15788,13 @@
   </w:style>
   <w:style w:type="paragraph" w:customStyle="1" w:styleId="TableParagraph">
     <w:name w:val="Table Paragraph"/>
-    <w:basedOn w:val="Normal"/>
+    <w:basedOn w:val="Binhthng"/>
     <w:uiPriority w:val="1"/>
     <w:qFormat/>
   </w:style>
-  <w:style w:type="paragraph" w:styleId="ListParagraph">
+  <w:style w:type="paragraph" w:styleId="oancuaDanhsach">
     <w:name w:val="List Paragraph"/>
-    <w:basedOn w:val="Normal"/>
+    <w:basedOn w:val="Binhthng"/>
     <w:uiPriority w:val="1"/>
     <w:qFormat/>
     <w:pPr>
@@ -15692,10 +15802,10 @@
       <w:ind w:left="2308" w:hanging="361"/>
     </w:pPr>
   </w:style>
-  <w:style w:type="paragraph" w:styleId="BalloonText">
+  <w:style w:type="paragraph" w:styleId="Bongchuthich">
     <w:name w:val="Balloon Text"/>
-    <w:basedOn w:val="Normal"/>
-    <w:link w:val="BalloonTextChar"/>
+    <w:basedOn w:val="Binhthng"/>
+    <w:link w:val="BongchuthichChar"/>
     <w:rsid w:val="006D557A"/>
     <w:pPr>
       <w:spacing w:after="0" w:line="240" w:lineRule="auto"/>
@@ -15706,10 +15816,10 @@
       <w:szCs w:val="16"/>
     </w:rPr>
   </w:style>
-  <w:style w:type="character" w:customStyle="1" w:styleId="BalloonTextChar">
-    <w:name w:val="Balloon Text Char"/>
-    <w:basedOn w:val="DefaultParagraphFont"/>
-    <w:link w:val="BalloonText"/>
+  <w:style w:type="character" w:customStyle="1" w:styleId="BongchuthichChar">
+    <w:name w:val="Bóng chú thích Char"/>
+    <w:basedOn w:val="Phngmcinhcuaoanvn"/>
+    <w:link w:val="Bongchuthich"/>
     <w:rsid w:val="006D557A"/>
     <w:rPr>
       <w:rFonts w:ascii="Tahoma" w:eastAsiaTheme="minorEastAsia" w:hAnsi="Tahoma" w:cs="Tahoma"/>
@@ -15718,9 +15828,9 @@
       <w:lang w:eastAsia="zh-CN"/>
     </w:rPr>
   </w:style>
-  <w:style w:type="paragraph" w:styleId="NormalWeb">
+  <w:style w:type="paragraph" w:styleId="ThngthngWeb">
     <w:name w:val="Normal (Web)"/>
-    <w:basedOn w:val="Normal"/>
+    <w:basedOn w:val="Binhthng"/>
     <w:uiPriority w:val="99"/>
     <w:unhideWhenUsed/>
     <w:rsid w:val="002A4880"/>
@@ -15734,10 +15844,10 @@
       <w:lang w:eastAsia="en-US"/>
     </w:rPr>
   </w:style>
-  <w:style w:type="character" w:customStyle="1" w:styleId="Heading3Char">
-    <w:name w:val="Heading 3 Char"/>
-    <w:basedOn w:val="DefaultParagraphFont"/>
-    <w:link w:val="Heading3"/>
+  <w:style w:type="character" w:customStyle="1" w:styleId="u3Char">
+    <w:name w:val="Đầu đề 3 Char"/>
+    <w:basedOn w:val="Phngmcinhcuaoanvn"/>
+    <w:link w:val="u3"/>
     <w:semiHidden/>
     <w:rsid w:val="002A4880"/>
     <w:rPr>
@@ -15748,10 +15858,10 @@
       <w:lang w:eastAsia="zh-CN"/>
     </w:rPr>
   </w:style>
-  <w:style w:type="paragraph" w:styleId="TOCHeading">
+  <w:style w:type="paragraph" w:styleId="uMucluc">
     <w:name w:val="TOC Heading"/>
-    <w:basedOn w:val="Heading1"/>
-    <w:next w:val="Normal"/>
+    <w:basedOn w:val="u1"/>
+    <w:next w:val="Binhthng"/>
     <w:uiPriority w:val="39"/>
     <w:unhideWhenUsed/>
     <w:qFormat/>
@@ -15771,10 +15881,10 @@
       <w:lang w:eastAsia="en-US"/>
     </w:rPr>
   </w:style>
-  <w:style w:type="paragraph" w:styleId="TOC1">
+  <w:style w:type="paragraph" w:styleId="Mucluc1">
     <w:name w:val="toc 1"/>
-    <w:basedOn w:val="Normal"/>
-    <w:next w:val="Normal"/>
+    <w:basedOn w:val="Binhthng"/>
+    <w:next w:val="Binhthng"/>
     <w:autoRedefine/>
     <w:uiPriority w:val="39"/>
     <w:unhideWhenUsed/>
@@ -15783,10 +15893,10 @@
       <w:spacing w:after="100"/>
     </w:pPr>
   </w:style>
-  <w:style w:type="paragraph" w:styleId="TOC2">
+  <w:style w:type="paragraph" w:styleId="Mucluc2">
     <w:name w:val="toc 2"/>
-    <w:basedOn w:val="Normal"/>
-    <w:next w:val="Normal"/>
+    <w:basedOn w:val="Binhthng"/>
+    <w:next w:val="Binhthng"/>
     <w:autoRedefine/>
     <w:uiPriority w:val="39"/>
     <w:unhideWhenUsed/>
@@ -15796,10 +15906,10 @@
       <w:ind w:left="200"/>
     </w:pPr>
   </w:style>
-  <w:style w:type="paragraph" w:styleId="Header">
+  <w:style w:type="paragraph" w:styleId="utrang">
     <w:name w:val="header"/>
-    <w:basedOn w:val="Normal"/>
-    <w:link w:val="HeaderChar"/>
+    <w:basedOn w:val="Binhthng"/>
+    <w:link w:val="utrangChar"/>
     <w:unhideWhenUsed/>
     <w:rsid w:val="00473850"/>
     <w:pPr>
@@ -15810,20 +15920,20 @@
       <w:spacing w:after="0" w:line="240" w:lineRule="auto"/>
     </w:pPr>
   </w:style>
-  <w:style w:type="character" w:customStyle="1" w:styleId="HeaderChar">
-    <w:name w:val="Header Char"/>
-    <w:basedOn w:val="DefaultParagraphFont"/>
-    <w:link w:val="Header"/>
+  <w:style w:type="character" w:customStyle="1" w:styleId="utrangChar">
+    <w:name w:val="Đầu trang Char"/>
+    <w:basedOn w:val="Phngmcinhcuaoanvn"/>
+    <w:link w:val="utrang"/>
     <w:rsid w:val="00473850"/>
     <w:rPr>
       <w:rFonts w:asciiTheme="minorHAnsi" w:eastAsiaTheme="minorEastAsia" w:hAnsiTheme="minorHAnsi" w:cstheme="minorBidi"/>
       <w:lang w:eastAsia="zh-CN"/>
     </w:rPr>
   </w:style>
-  <w:style w:type="paragraph" w:styleId="Footer">
+  <w:style w:type="paragraph" w:styleId="Chntrang">
     <w:name w:val="footer"/>
-    <w:basedOn w:val="Normal"/>
-    <w:link w:val="FooterChar"/>
+    <w:basedOn w:val="Binhthng"/>
+    <w:link w:val="ChntrangChar"/>
     <w:uiPriority w:val="99"/>
     <w:unhideWhenUsed/>
     <w:rsid w:val="00473850"/>
@@ -15835,10 +15945,10 @@
       <w:spacing w:after="0" w:line="240" w:lineRule="auto"/>
     </w:pPr>
   </w:style>
-  <w:style w:type="character" w:customStyle="1" w:styleId="FooterChar">
-    <w:name w:val="Footer Char"/>
-    <w:basedOn w:val="DefaultParagraphFont"/>
-    <w:link w:val="Footer"/>
+  <w:style w:type="character" w:customStyle="1" w:styleId="ChntrangChar">
+    <w:name w:val="Chân trang Char"/>
+    <w:basedOn w:val="Phngmcinhcuaoanvn"/>
+    <w:link w:val="Chntrang"/>
     <w:uiPriority w:val="99"/>
     <w:rsid w:val="00473850"/>
     <w:rPr>
@@ -15848,12 +15958,12 @@
   </w:style>
   <w:style w:type="character" w:customStyle="1" w:styleId="citation-188">
     <w:name w:val="citation-188"/>
-    <w:basedOn w:val="DefaultParagraphFont"/>
+    <w:basedOn w:val="Phngmcinhcuaoanvn"/>
     <w:rsid w:val="00F9524F"/>
   </w:style>
-  <w:style w:type="character" w:styleId="Emphasis">
+  <w:style w:type="character" w:styleId="Nhnmanh">
     <w:name w:val="Emphasis"/>
-    <w:basedOn w:val="DefaultParagraphFont"/>
+    <w:basedOn w:val="Phngmcinhcuaoanvn"/>
     <w:qFormat/>
     <w:rsid w:val="009901B4"/>
     <w:rPr>
@@ -15861,9 +15971,9 @@
       <w:iCs/>
     </w:rPr>
   </w:style>
-  <w:style w:type="character" w:styleId="UnresolvedMention">
+  <w:style w:type="character" w:styleId="cpChagiiquyt">
     <w:name w:val="Unresolved Mention"/>
-    <w:basedOn w:val="DefaultParagraphFont"/>
+    <w:basedOn w:val="Phngmcinhcuaoanvn"/>
     <w:uiPriority w:val="99"/>
     <w:semiHidden/>
     <w:unhideWhenUsed/>
@@ -15873,10 +15983,10 @@
       <w:shd w:val="clear" w:color="auto" w:fill="E1DFDD"/>
     </w:rPr>
   </w:style>
-  <w:style w:type="character" w:customStyle="1" w:styleId="Heading1Char">
-    <w:name w:val="Heading 1 Char"/>
-    <w:basedOn w:val="DefaultParagraphFont"/>
-    <w:link w:val="Heading1"/>
+  <w:style w:type="character" w:customStyle="1" w:styleId="u1Char">
+    <w:name w:val="Đầu đề 1 Char"/>
+    <w:basedOn w:val="Phngmcinhcuaoanvn"/>
+    <w:link w:val="u1"/>
     <w:rsid w:val="00FD37C5"/>
     <w:rPr>
       <w:rFonts w:eastAsiaTheme="minorEastAsia" w:cstheme="minorBidi"/>
@@ -15888,10 +15998,10 @@
       <w:lang w:eastAsia="zh-CN"/>
     </w:rPr>
   </w:style>
-  <w:style w:type="character" w:customStyle="1" w:styleId="Heading2Char">
-    <w:name w:val="Heading 2 Char"/>
-    <w:basedOn w:val="DefaultParagraphFont"/>
-    <w:link w:val="Heading2"/>
+  <w:style w:type="character" w:customStyle="1" w:styleId="u2Char">
+    <w:name w:val="Đầu đề 2 Char"/>
+    <w:basedOn w:val="Phngmcinhcuaoanvn"/>
+    <w:link w:val="u2"/>
     <w:rsid w:val="0082306C"/>
     <w:rPr>
       <w:rFonts w:eastAsiaTheme="minorEastAsia" w:cstheme="minorBidi"/>

</xml_diff>